<commit_message>
Update project documentation with detailed prototype development phases and methodologies
</commit_message>
<xml_diff>
--- a/1789380229.docx
+++ b/1789380229.docx
@@ -1,6 +1,6 @@
 
 <file path=word/document.xml><?xml version="1.0" encoding="utf-8"?>
-<w:document xmlns:wpc="http://schemas.microsoft.com/office/word/2010/wordprocessingCanvas" xmlns:cx="http://schemas.microsoft.com/office/drawing/2014/chartex" xmlns:cx1="http://schemas.microsoft.com/office/drawing/2015/9/8/chartex" xmlns:cx2="http://schemas.microsoft.com/office/drawing/2015/10/21/chartex" xmlns:cx3="http://schemas.microsoft.com/office/drawing/2016/5/9/chartex" xmlns:cx4="http://schemas.microsoft.com/office/drawing/2016/5/10/chartex" xmlns:cx5="http://schemas.microsoft.com/office/drawing/2016/5/11/chartex" xmlns:cx6="http://schemas.microsoft.com/office/drawing/2016/5/12/chartex" xmlns:cx7="http://schemas.microsoft.com/office/drawing/2016/5/13/chartex" xmlns:cx8="http://schemas.microsoft.com/office/drawing/2016/5/14/chartex" xmlns:mc="http://schemas.openxmlformats.org/markup-compatibility/2006" xmlns:aink="http://schemas.microsoft.com/office/drawing/2016/ink" xmlns:am3d="http://schemas.microsoft.com/office/drawing/2017/model3d" xmlns:o="urn:schemas-microsoft-com:office:office" xmlns:oel="http://schemas.microsoft.com/office/2019/extlst" xmlns:r="http://schemas.openxmlformats.org/officeDocument/2006/relationships" xmlns:m="http://schemas.openxmlformats.org/officeDocument/2006/math" xmlns:v="urn:schemas-microsoft-com:vml" xmlns:wp14="http://schemas.microsoft.com/office/word/2010/wordprocessingDrawing" xmlns:wp="http://schemas.openxmlformats.org/drawingml/2006/wordprocessingDrawing" xmlns:w10="urn:schemas-microsoft-com:office:word" xmlns:w="http://schemas.openxmlformats.org/wordprocessingml/2006/main" xmlns:w14="http://schemas.microsoft.com/office/word/2010/wordml" xmlns:w15="http://schemas.microsoft.com/office/word/2012/wordml" xmlns:w16cex="http://schemas.microsoft.com/office/word/2018/wordml/cex" xmlns:w16cid="http://schemas.microsoft.com/office/word/2016/wordml/cid" xmlns:w16="http://schemas.microsoft.com/office/word/2018/wordml" xmlns:w16sdtdh="http://schemas.microsoft.com/office/word/2020/wordml/sdtdatahash" xmlns:w16se="http://schemas.microsoft.com/office/word/2015/wordml/symex" xmlns:wpg="http://schemas.microsoft.com/office/word/2010/wordprocessingGroup" xmlns:wpi="http://schemas.microsoft.com/office/word/2010/wordprocessingInk" xmlns:wne="http://schemas.microsoft.com/office/word/2006/wordml" xmlns:wps="http://schemas.microsoft.com/office/word/2010/wordprocessingShape" mc:Ignorable="w14 w15 w16se w16cid w16 w16cex w16sdtdh wp14">
+<w:document xmlns:wpc="http://schemas.microsoft.com/office/word/2010/wordprocessingCanvas" xmlns:mc="http://schemas.openxmlformats.org/markup-compatibility/2006" xmlns:o="urn:schemas-microsoft-com:office:office" xmlns:r="http://schemas.openxmlformats.org/officeDocument/2006/relationships" xmlns:m="http://schemas.openxmlformats.org/officeDocument/2006/math" xmlns:v="urn:schemas-microsoft-com:vml" xmlns:wp14="http://schemas.microsoft.com/office/word/2010/wordprocessingDrawing" xmlns:wp="http://schemas.openxmlformats.org/drawingml/2006/wordprocessingDrawing" xmlns:w10="urn:schemas-microsoft-com:office:word" xmlns:w="http://schemas.openxmlformats.org/wordprocessingml/2006/main" xmlns:w14="http://schemas.microsoft.com/office/word/2010/wordml" xmlns:w15="http://schemas.microsoft.com/office/word/2012/wordml" xmlns:wpg="http://schemas.microsoft.com/office/word/2010/wordprocessingGroup" xmlns:wpi="http://schemas.microsoft.com/office/word/2010/wordprocessingInk" xmlns:wne="http://schemas.microsoft.com/office/word/2006/wordml" xmlns:wps="http://schemas.microsoft.com/office/word/2010/wordprocessingShape" mc:Ignorable="w14 w15 wp14">
   <w:body>
     <w:tbl>
       <w:tblPr>
@@ -17,8 +17,8 @@
         <w:tblLook w:val="04A0" w:firstRow="1" w:lastRow="0" w:firstColumn="1" w:lastColumn="0" w:noHBand="0" w:noVBand="1"/>
       </w:tblPr>
       <w:tblGrid>
-        <w:gridCol w:w="4762"/>
-        <w:gridCol w:w="4860"/>
+        <w:gridCol w:w="4761"/>
+        <w:gridCol w:w="4861"/>
       </w:tblGrid>
       <w:tr>
         <w:tc>
@@ -58,7 +58,7 @@
                           <pic:cNvPicPr/>
                         </pic:nvPicPr>
                         <pic:blipFill>
-                          <a:blip r:embed="rId4" cstate="print">
+                          <a:blip r:embed="rId5" cstate="print">
                             <a:extLst>
                               <a:ext uri="{28A0092B-C50C-407E-A947-70E740481C1C}">
                                 <a14:useLocalDpi xmlns:a14="http://schemas.microsoft.com/office/drawing/2010/main" val="0"/>
@@ -137,7 +137,7 @@
                           <pic:cNvPicPr/>
                         </pic:nvPicPr>
                         <pic:blipFill>
-                          <a:blip r:embed="rId5">
+                          <a:blip r:embed="rId6">
                             <a:extLst>
                               <a:ext uri="{28A0092B-C50C-407E-A947-70E740481C1C}">
                                 <a14:useLocalDpi xmlns:a14="http://schemas.microsoft.com/office/drawing/2010/main" val="0"/>
@@ -209,7 +209,7 @@
                           <pic:cNvPicPr/>
                         </pic:nvPicPr>
                         <pic:blipFill>
-                          <a:blip r:embed="rId6">
+                          <a:blip r:embed="rId7">
                             <a:extLst>
                               <a:ext uri="{28A0092B-C50C-407E-A947-70E740481C1C}">
                                 <a14:useLocalDpi xmlns:a14="http://schemas.microsoft.com/office/drawing/2010/main" val="0"/>
@@ -274,7 +274,7 @@
                           <pic:cNvPicPr/>
                         </pic:nvPicPr>
                         <pic:blipFill>
-                          <a:blip r:embed="rId7"/>
+                          <a:blip r:embed="rId8"/>
                           <a:stretch>
                             <a:fillRect/>
                           </a:stretch>
@@ -339,7 +339,7 @@
                           <pic:cNvPicPr/>
                         </pic:nvPicPr>
                         <pic:blipFill>
-                          <a:blip r:embed="rId8">
+                          <a:blip r:embed="rId9">
                             <a:extLst>
                               <a:ext uri="{28A0092B-C50C-407E-A947-70E740481C1C}">
                                 <a14:useLocalDpi xmlns:a14="http://schemas.microsoft.com/office/drawing/2010/main" val="0"/>
@@ -408,7 +408,7 @@
                           <pic:cNvPicPr/>
                         </pic:nvPicPr>
                         <pic:blipFill>
-                          <a:blip r:embed="rId9"/>
+                          <a:blip r:embed="rId10"/>
                           <a:stretch>
                             <a:fillRect/>
                           </a:stretch>
@@ -473,7 +473,7 @@
                           <pic:cNvPicPr/>
                         </pic:nvPicPr>
                         <pic:blipFill>
-                          <a:blip r:embed="rId10">
+                          <a:blip r:embed="rId11">
                             <a:extLst>
                               <a:ext uri="{28A0092B-C50C-407E-A947-70E740481C1C}">
                                 <a14:useLocalDpi xmlns:a14="http://schemas.microsoft.com/office/drawing/2010/main" val="0"/>
@@ -539,7 +539,7 @@
                           <pic:cNvPicPr/>
                         </pic:nvPicPr>
                         <pic:blipFill>
-                          <a:blip r:embed="rId11">
+                          <a:blip r:embed="rId12">
                             <a:extLst>
                               <a:ext uri="{28A0092B-C50C-407E-A947-70E740481C1C}">
                                 <a14:useLocalDpi xmlns:a14="http://schemas.microsoft.com/office/drawing/2010/main" val="0"/>
@@ -613,7 +613,7 @@
                           <pic:cNvPicPr/>
                         </pic:nvPicPr>
                         <pic:blipFill>
-                          <a:blip r:embed="rId12">
+                          <a:blip r:embed="rId13">
                             <a:extLst>
                               <a:ext uri="{28A0092B-C50C-407E-A947-70E740481C1C}">
                                 <a14:useLocalDpi xmlns:a14="http://schemas.microsoft.com/office/drawing/2010/main" val="0"/>
@@ -666,7 +666,17 @@
                 <w:szCs w:val="24"/>
                 <w:lang w:val="it-IT"/>
               </w:rPr>
-              <w:t>Inserisci qui il testo</w:t>
+              <w:t xml:space="preserve">Inserisci </w:t>
+            </w:r>
+            <w:r>
+              <w:rPr>
+                <w:rFonts w:ascii="Times New Roman" w:hAnsi="Times New Roman" w:cs="Times New Roman"/>
+                <w:color w:val="FF0000"/>
+                <w:sz w:val="24"/>
+                <w:szCs w:val="24"/>
+                <w:lang w:val="it-IT"/>
+              </w:rPr>
+              <w:t>qui il testo</w:t>
             </w:r>
           </w:p>
         </w:tc>
@@ -716,7 +726,7 @@
                           <pic:cNvPicPr/>
                         </pic:nvPicPr>
                         <pic:blipFill>
-                          <a:blip r:embed="rId13">
+                          <a:blip r:embed="rId14">
                             <a:extLst>
                               <a:ext uri="{28A0092B-C50C-407E-A947-70E740481C1C}">
                                 <a14:useLocalDpi xmlns:a14="http://schemas.microsoft.com/office/drawing/2010/main" val="0"/>
@@ -812,7 +822,7 @@
                           <pic:cNvPicPr/>
                         </pic:nvPicPr>
                         <pic:blipFill>
-                          <a:blip r:embed="rId14">
+                          <a:blip r:embed="rId15">
                             <a:extLst>
                               <a:ext uri="{28A0092B-C50C-407E-A947-70E740481C1C}">
                                 <a14:useLocalDpi xmlns:a14="http://schemas.microsoft.com/office/drawing/2010/main" val="0"/>
@@ -906,7 +916,7 @@
                           <pic:cNvPicPr/>
                         </pic:nvPicPr>
                         <pic:blipFill>
-                          <a:blip r:embed="rId15">
+                          <a:blip r:embed="rId16">
                             <a:extLst>
                               <a:ext uri="{28A0092B-C50C-407E-A947-70E740481C1C}">
                                 <a14:useLocalDpi xmlns:a14="http://schemas.microsoft.com/office/drawing/2010/main" val="0"/>
@@ -1000,7 +1010,7 @@
                           <pic:cNvPicPr/>
                         </pic:nvPicPr>
                         <pic:blipFill>
-                          <a:blip r:embed="rId16">
+                          <a:blip r:embed="rId17">
                             <a:extLst>
                               <a:ext uri="{28A0092B-C50C-407E-A947-70E740481C1C}">
                                 <a14:useLocalDpi xmlns:a14="http://schemas.microsoft.com/office/drawing/2010/main" val="0"/>
@@ -1094,7 +1104,7 @@
                           <pic:cNvPicPr/>
                         </pic:nvPicPr>
                         <pic:blipFill>
-                          <a:blip r:embed="rId17">
+                          <a:blip r:embed="rId18">
                             <a:extLst>
                               <a:ext uri="{28A0092B-C50C-407E-A947-70E740481C1C}">
                                 <a14:useLocalDpi xmlns:a14="http://schemas.microsoft.com/office/drawing/2010/main" val="0"/>
@@ -1190,7 +1200,7 @@
                           <pic:cNvPicPr/>
                         </pic:nvPicPr>
                         <pic:blipFill>
-                          <a:blip r:embed="rId18">
+                          <a:blip r:embed="rId19">
                             <a:extLst>
                               <a:ext uri="{28A0092B-C50C-407E-A947-70E740481C1C}">
                                 <a14:useLocalDpi xmlns:a14="http://schemas.microsoft.com/office/drawing/2010/main" val="0"/>
@@ -1290,7 +1300,7 @@
                           <pic:cNvPicPr/>
                         </pic:nvPicPr>
                         <pic:blipFill>
-                          <a:blip r:embed="rId19">
+                          <a:blip r:embed="rId20">
                             <a:extLst>
                               <a:ext uri="{28A0092B-C50C-407E-A947-70E740481C1C}">
                                 <a14:useLocalDpi xmlns:a14="http://schemas.microsoft.com/office/drawing/2010/main" val="0"/>
@@ -1362,7 +1372,7 @@
                           <pic:cNvPicPr/>
                         </pic:nvPicPr>
                         <pic:blipFill>
-                          <a:blip r:embed="rId20">
+                          <a:blip r:embed="rId21">
                             <a:extLst>
                               <a:ext uri="{28A0092B-C50C-407E-A947-70E740481C1C}">
                                 <a14:useLocalDpi xmlns:a14="http://schemas.microsoft.com/office/drawing/2010/main" val="0"/>
@@ -1399,24 +1409,52 @@
           </w:tcPr>
           <w:p>
             <w:pPr>
-              <w:jc w:val="both"/>
-              <w:rPr>
-                <w:rFonts w:ascii="Times New Roman" w:hAnsi="Times New Roman" w:cs="Times New Roman"/>
-                <w:color w:val="FF0000"/>
-                <w:sz w:val="24"/>
-                <w:szCs w:val="24"/>
-                <w:lang w:val="it-IT"/>
-              </w:rPr>
-            </w:pPr>
-            <w:r>
-              <w:rPr>
-                <w:rFonts w:ascii="Times New Roman" w:hAnsi="Times New Roman" w:cs="Times New Roman"/>
-                <w:color w:val="FF0000"/>
-                <w:sz w:val="24"/>
-                <w:szCs w:val="24"/>
-                <w:lang w:val="it-IT"/>
-              </w:rPr>
-              <w:t>Inserisci qui il testo</w:t>
+              <w:pStyle w:val="NormaleWeb"/>
+            </w:pPr>
+            <w:r>
+              <w:t xml:space="preserve">Il presente elaborato applica in modo integrato le competenze teoriche e pratiche acquisite durante il percorso di studi nel corso di laurea in </w:t>
+            </w:r>
+            <w:r>
+              <w:rPr>
+                <w:b/>
+                <w:bCs/>
+              </w:rPr>
+              <w:t>Informatica per le aziende digitali (L-31)</w:t>
+            </w:r>
+            <w:r>
+              <w:t>. In particolare, sono state valorizzate le conoscenze maturate negli insegnamenti di programmazione avanzata, basi di dati, ingegneria del software e statistica applicata.</w:t>
+            </w:r>
+          </w:p>
+          <w:p>
+            <w:pPr>
+              <w:pStyle w:val="NormaleWeb"/>
+            </w:pPr>
+            <w:r>
+              <w:t xml:space="preserve">Lo sviluppo del prototipo ha richiesto l'utilizzo di paradigmi di programmazione modulare in </w:t>
+            </w:r>
+            <w:proofErr w:type="spellStart"/>
+            <w:r>
+              <w:t>Python</w:t>
+            </w:r>
+            <w:proofErr w:type="spellEnd"/>
+            <w:r>
+              <w:t>, la gestione strutturata della persistenza dei dati e dei modelli di Machine Learning, nonché la progettazione di un'interfaccia utente interattiva orientata all'analisi aziendale (Business Intelligence). L'uso di strumenti di controllo di versione (</w:t>
+            </w:r>
+            <w:proofErr w:type="spellStart"/>
+            <w:r>
+              <w:t>Git</w:t>
+            </w:r>
+            <w:proofErr w:type="spellEnd"/>
+            <w:r>
+              <w:t xml:space="preserve">) e di </w:t>
+            </w:r>
+            <w:proofErr w:type="spellStart"/>
+            <w:r>
+              <w:t>framework</w:t>
+            </w:r>
+            <w:proofErr w:type="spellEnd"/>
+            <w:r>
+              <w:t xml:space="preserve"> per la visualizzazione e l'elaborazione dei dati ha permesso di tradurre concetti algoritmici astratti in una soluzione software robusta e pronta per l'uso professionale.</w:t>
             </w:r>
           </w:p>
           <w:p>
@@ -1471,7 +1509,7 @@
                           <pic:cNvPicPr/>
                         </pic:nvPicPr>
                         <pic:blipFill>
-                          <a:blip r:embed="rId21">
+                          <a:blip r:embed="rId22">
                             <a:extLst>
                               <a:ext uri="{28A0092B-C50C-407E-A947-70E740481C1C}">
                                 <a14:useLocalDpi xmlns:a14="http://schemas.microsoft.com/office/drawing/2010/main" val="0"/>
@@ -1508,23 +1546,670 @@
           </w:tcPr>
           <w:p>
             <w:pPr>
-              <w:jc w:val="both"/>
-              <w:rPr>
-                <w:rFonts w:ascii="Times New Roman" w:hAnsi="Times New Roman" w:cs="Times New Roman"/>
-                <w:sz w:val="28"/>
-                <w:szCs w:val="28"/>
-                <w:lang w:val="it-IT"/>
-              </w:rPr>
-            </w:pPr>
-            <w:r>
-              <w:rPr>
-                <w:rFonts w:ascii="Times New Roman" w:hAnsi="Times New Roman" w:cs="Times New Roman"/>
-                <w:color w:val="FF0000"/>
-                <w:sz w:val="24"/>
-                <w:szCs w:val="24"/>
-                <w:lang w:val="it-IT"/>
-              </w:rPr>
-              <w:t>Inserisci qui il testo</w:t>
+              <w:spacing w:before="100" w:beforeAutospacing="1" w:after="100" w:afterAutospacing="1" w:line="240" w:lineRule="auto"/>
+              <w:rPr>
+                <w:rFonts w:ascii="Times New Roman" w:eastAsia="Times New Roman" w:hAnsi="Times New Roman" w:cs="Times New Roman"/>
+                <w:sz w:val="24"/>
+                <w:szCs w:val="24"/>
+                <w:lang w:val="it-IT"/>
+              </w:rPr>
+            </w:pPr>
+            <w:r>
+              <w:rPr>
+                <w:rFonts w:ascii="Times New Roman" w:eastAsia="Times New Roman" w:hAnsi="Times New Roman" w:cs="Times New Roman"/>
+                <w:sz w:val="24"/>
+                <w:szCs w:val="24"/>
+                <w:lang w:val="it-IT"/>
+              </w:rPr>
+              <w:t>Il progetto è stato suddiviso in cinque fasi operative principali, completate nell'arco di circa due settimane:</w:t>
+            </w:r>
+            <w:bookmarkStart w:id="0" w:name="_GoBack"/>
+            <w:bookmarkEnd w:id="0"/>
+          </w:p>
+          <w:p>
+            <w:pPr>
+              <w:numPr>
+                <w:ilvl w:val="0"/>
+                <w:numId w:val="1"/>
+              </w:numPr>
+              <w:spacing w:before="100" w:beforeAutospacing="1" w:after="100" w:afterAutospacing="1" w:line="240" w:lineRule="auto"/>
+              <w:rPr>
+                <w:rFonts w:ascii="Times New Roman" w:eastAsia="Times New Roman" w:hAnsi="Times New Roman" w:cs="Times New Roman"/>
+                <w:sz w:val="24"/>
+                <w:szCs w:val="24"/>
+                <w:lang w:val="it-IT"/>
+              </w:rPr>
+            </w:pPr>
+            <w:r>
+              <w:rPr>
+                <w:rFonts w:ascii="Times New Roman" w:eastAsia="Times New Roman" w:hAnsi="Times New Roman" w:cs="Times New Roman"/>
+                <w:b/>
+                <w:bCs/>
+                <w:sz w:val="24"/>
+                <w:szCs w:val="24"/>
+                <w:lang w:val="it-IT"/>
+              </w:rPr>
+              <w:t>Fase 1: Analisi dei requisiti e architettura (2 giorni)</w:t>
+            </w:r>
+          </w:p>
+          <w:p>
+            <w:pPr>
+              <w:numPr>
+                <w:ilvl w:val="1"/>
+                <w:numId w:val="1"/>
+              </w:numPr>
+              <w:spacing w:before="100" w:beforeAutospacing="1" w:after="100" w:afterAutospacing="1" w:line="240" w:lineRule="auto"/>
+              <w:rPr>
+                <w:rFonts w:ascii="Times New Roman" w:eastAsia="Times New Roman" w:hAnsi="Times New Roman" w:cs="Times New Roman"/>
+                <w:sz w:val="24"/>
+                <w:szCs w:val="24"/>
+                <w:lang w:val="it-IT"/>
+              </w:rPr>
+            </w:pPr>
+            <w:r>
+              <w:rPr>
+                <w:rFonts w:ascii="Times New Roman" w:eastAsia="Times New Roman" w:hAnsi="Times New Roman" w:cs="Times New Roman"/>
+                <w:i/>
+                <w:iCs/>
+                <w:sz w:val="24"/>
+                <w:szCs w:val="24"/>
+                <w:lang w:val="it-IT"/>
+              </w:rPr>
+              <w:lastRenderedPageBreak/>
+              <w:t>Attività:</w:t>
+            </w:r>
+            <w:r>
+              <w:rPr>
+                <w:rFonts w:ascii="Times New Roman" w:eastAsia="Times New Roman" w:hAnsi="Times New Roman" w:cs="Times New Roman"/>
+                <w:sz w:val="24"/>
+                <w:szCs w:val="24"/>
+                <w:lang w:val="it-IT"/>
+              </w:rPr>
+              <w:t xml:space="preserve"> Studio approfondito della traccia, definizione della struttura modulare del progetto (</w:t>
+            </w:r>
+            <w:proofErr w:type="spellStart"/>
+            <w:r>
+              <w:rPr>
+                <w:rFonts w:ascii="Courier New" w:eastAsia="Times New Roman" w:hAnsi="Courier New" w:cs="Courier New"/>
+                <w:sz w:val="20"/>
+                <w:szCs w:val="20"/>
+                <w:lang w:val="it-IT"/>
+              </w:rPr>
+              <w:t>src</w:t>
+            </w:r>
+            <w:proofErr w:type="spellEnd"/>
+            <w:r>
+              <w:rPr>
+                <w:rFonts w:ascii="Courier New" w:eastAsia="Times New Roman" w:hAnsi="Courier New" w:cs="Courier New"/>
+                <w:sz w:val="20"/>
+                <w:szCs w:val="20"/>
+                <w:lang w:val="it-IT"/>
+              </w:rPr>
+              <w:t>/</w:t>
+            </w:r>
+            <w:r>
+              <w:rPr>
+                <w:rFonts w:ascii="Times New Roman" w:eastAsia="Times New Roman" w:hAnsi="Times New Roman" w:cs="Times New Roman"/>
+                <w:sz w:val="24"/>
+                <w:szCs w:val="24"/>
+                <w:lang w:val="it-IT"/>
+              </w:rPr>
+              <w:t xml:space="preserve">, </w:t>
+            </w:r>
+            <w:r>
+              <w:rPr>
+                <w:rFonts w:ascii="Courier New" w:eastAsia="Times New Roman" w:hAnsi="Courier New" w:cs="Courier New"/>
+                <w:sz w:val="20"/>
+                <w:szCs w:val="20"/>
+                <w:lang w:val="it-IT"/>
+              </w:rPr>
+              <w:t>data/</w:t>
+            </w:r>
+            <w:r>
+              <w:rPr>
+                <w:rFonts w:ascii="Times New Roman" w:eastAsia="Times New Roman" w:hAnsi="Times New Roman" w:cs="Times New Roman"/>
+                <w:sz w:val="24"/>
+                <w:szCs w:val="24"/>
+                <w:lang w:val="it-IT"/>
+              </w:rPr>
+              <w:t xml:space="preserve">, </w:t>
+            </w:r>
+            <w:proofErr w:type="spellStart"/>
+            <w:r>
+              <w:rPr>
+                <w:rFonts w:ascii="Courier New" w:eastAsia="Times New Roman" w:hAnsi="Courier New" w:cs="Courier New"/>
+                <w:sz w:val="20"/>
+                <w:szCs w:val="20"/>
+                <w:lang w:val="it-IT"/>
+              </w:rPr>
+              <w:t>models</w:t>
+            </w:r>
+            <w:proofErr w:type="spellEnd"/>
+            <w:r>
+              <w:rPr>
+                <w:rFonts w:ascii="Courier New" w:eastAsia="Times New Roman" w:hAnsi="Courier New" w:cs="Courier New"/>
+                <w:sz w:val="20"/>
+                <w:szCs w:val="20"/>
+                <w:lang w:val="it-IT"/>
+              </w:rPr>
+              <w:t>/</w:t>
+            </w:r>
+            <w:r>
+              <w:rPr>
+                <w:rFonts w:ascii="Times New Roman" w:eastAsia="Times New Roman" w:hAnsi="Times New Roman" w:cs="Times New Roman"/>
+                <w:sz w:val="24"/>
+                <w:szCs w:val="24"/>
+                <w:lang w:val="it-IT"/>
+              </w:rPr>
+              <w:t xml:space="preserve">, </w:t>
+            </w:r>
+            <w:r>
+              <w:rPr>
+                <w:rFonts w:ascii="Courier New" w:eastAsia="Times New Roman" w:hAnsi="Courier New" w:cs="Courier New"/>
+                <w:sz w:val="20"/>
+                <w:szCs w:val="20"/>
+                <w:lang w:val="it-IT"/>
+              </w:rPr>
+              <w:t>reports/</w:t>
+            </w:r>
+            <w:r>
+              <w:rPr>
+                <w:rFonts w:ascii="Times New Roman" w:eastAsia="Times New Roman" w:hAnsi="Times New Roman" w:cs="Times New Roman"/>
+                <w:sz w:val="24"/>
+                <w:szCs w:val="24"/>
+                <w:lang w:val="it-IT"/>
+              </w:rPr>
+              <w:t>) e pianificazione dei KPI di business.</w:t>
+            </w:r>
+          </w:p>
+          <w:p>
+            <w:pPr>
+              <w:numPr>
+                <w:ilvl w:val="0"/>
+                <w:numId w:val="1"/>
+              </w:numPr>
+              <w:spacing w:before="100" w:beforeAutospacing="1" w:after="100" w:afterAutospacing="1" w:line="240" w:lineRule="auto"/>
+              <w:rPr>
+                <w:rFonts w:ascii="Times New Roman" w:eastAsia="Times New Roman" w:hAnsi="Times New Roman" w:cs="Times New Roman"/>
+                <w:sz w:val="24"/>
+                <w:szCs w:val="24"/>
+                <w:lang w:val="it-IT"/>
+              </w:rPr>
+            </w:pPr>
+            <w:r>
+              <w:rPr>
+                <w:rFonts w:ascii="Times New Roman" w:eastAsia="Times New Roman" w:hAnsi="Times New Roman" w:cs="Times New Roman"/>
+                <w:b/>
+                <w:bCs/>
+                <w:sz w:val="24"/>
+                <w:szCs w:val="24"/>
+                <w:lang w:val="it-IT"/>
+              </w:rPr>
+              <w:t xml:space="preserve">Fase 2: Generazione e </w:t>
+            </w:r>
+            <w:proofErr w:type="spellStart"/>
+            <w:r>
+              <w:rPr>
+                <w:rFonts w:ascii="Times New Roman" w:eastAsia="Times New Roman" w:hAnsi="Times New Roman" w:cs="Times New Roman"/>
+                <w:b/>
+                <w:bCs/>
+                <w:sz w:val="24"/>
+                <w:szCs w:val="24"/>
+                <w:lang w:val="it-IT"/>
+              </w:rPr>
+              <w:t>pre</w:t>
+            </w:r>
+            <w:proofErr w:type="spellEnd"/>
+            <w:r>
+              <w:rPr>
+                <w:rFonts w:ascii="Times New Roman" w:eastAsia="Times New Roman" w:hAnsi="Times New Roman" w:cs="Times New Roman"/>
+                <w:b/>
+                <w:bCs/>
+                <w:sz w:val="24"/>
+                <w:szCs w:val="24"/>
+                <w:lang w:val="it-IT"/>
+              </w:rPr>
+              <w:t>-elaborazione dei dati (2 giorni)</w:t>
+            </w:r>
+          </w:p>
+          <w:p>
+            <w:pPr>
+              <w:numPr>
+                <w:ilvl w:val="1"/>
+                <w:numId w:val="1"/>
+              </w:numPr>
+              <w:spacing w:before="100" w:beforeAutospacing="1" w:after="100" w:afterAutospacing="1" w:line="240" w:lineRule="auto"/>
+              <w:rPr>
+                <w:rFonts w:ascii="Times New Roman" w:eastAsia="Times New Roman" w:hAnsi="Times New Roman" w:cs="Times New Roman"/>
+                <w:sz w:val="24"/>
+                <w:szCs w:val="24"/>
+                <w:lang w:val="it-IT"/>
+              </w:rPr>
+            </w:pPr>
+            <w:r>
+              <w:rPr>
+                <w:rFonts w:ascii="Times New Roman" w:eastAsia="Times New Roman" w:hAnsi="Times New Roman" w:cs="Times New Roman"/>
+                <w:i/>
+                <w:iCs/>
+                <w:sz w:val="24"/>
+                <w:szCs w:val="24"/>
+                <w:lang w:val="it-IT"/>
+              </w:rPr>
+              <w:t>Attività:</w:t>
+            </w:r>
+            <w:r>
+              <w:rPr>
+                <w:rFonts w:ascii="Times New Roman" w:eastAsia="Times New Roman" w:hAnsi="Times New Roman" w:cs="Times New Roman"/>
+                <w:sz w:val="24"/>
+                <w:szCs w:val="24"/>
+                <w:lang w:val="it-IT"/>
+              </w:rPr>
+              <w:t xml:space="preserve"> Scrittura del generatore di dati sintetici basato su profili comportamentali noti, introduzione controllata di imperfezioni (valori mancanti, </w:t>
+            </w:r>
+            <w:proofErr w:type="spellStart"/>
+            <w:r>
+              <w:rPr>
+                <w:rFonts w:ascii="Times New Roman" w:eastAsia="Times New Roman" w:hAnsi="Times New Roman" w:cs="Times New Roman"/>
+                <w:sz w:val="24"/>
+                <w:szCs w:val="24"/>
+                <w:lang w:val="it-IT"/>
+              </w:rPr>
+              <w:t>outlier</w:t>
+            </w:r>
+            <w:proofErr w:type="spellEnd"/>
+            <w:r>
+              <w:rPr>
+                <w:rFonts w:ascii="Times New Roman" w:eastAsia="Times New Roman" w:hAnsi="Times New Roman" w:cs="Times New Roman"/>
+                <w:sz w:val="24"/>
+                <w:szCs w:val="24"/>
+                <w:lang w:val="it-IT"/>
+              </w:rPr>
+              <w:t xml:space="preserve"> e duplicati) per simulare un contesto reale.</w:t>
+            </w:r>
+          </w:p>
+          <w:p>
+            <w:pPr>
+              <w:numPr>
+                <w:ilvl w:val="0"/>
+                <w:numId w:val="1"/>
+              </w:numPr>
+              <w:spacing w:before="100" w:beforeAutospacing="1" w:after="100" w:afterAutospacing="1" w:line="240" w:lineRule="auto"/>
+              <w:rPr>
+                <w:rFonts w:ascii="Times New Roman" w:eastAsia="Times New Roman" w:hAnsi="Times New Roman" w:cs="Times New Roman"/>
+                <w:sz w:val="24"/>
+                <w:szCs w:val="24"/>
+                <w:lang w:val="it-IT"/>
+              </w:rPr>
+            </w:pPr>
+            <w:r>
+              <w:rPr>
+                <w:rFonts w:ascii="Times New Roman" w:eastAsia="Times New Roman" w:hAnsi="Times New Roman" w:cs="Times New Roman"/>
+                <w:b/>
+                <w:bCs/>
+                <w:sz w:val="24"/>
+                <w:szCs w:val="24"/>
+                <w:lang w:val="it-IT"/>
+              </w:rPr>
+              <w:t>Fase 3: Sviluppo della pipeline di Machine Learning (3 giorni)</w:t>
+            </w:r>
+          </w:p>
+          <w:p>
+            <w:pPr>
+              <w:numPr>
+                <w:ilvl w:val="1"/>
+                <w:numId w:val="1"/>
+              </w:numPr>
+              <w:spacing w:before="100" w:beforeAutospacing="1" w:after="100" w:afterAutospacing="1" w:line="240" w:lineRule="auto"/>
+              <w:rPr>
+                <w:rFonts w:ascii="Times New Roman" w:eastAsia="Times New Roman" w:hAnsi="Times New Roman" w:cs="Times New Roman"/>
+                <w:sz w:val="24"/>
+                <w:szCs w:val="24"/>
+                <w:lang w:val="it-IT"/>
+              </w:rPr>
+            </w:pPr>
+            <w:r>
+              <w:rPr>
+                <w:rFonts w:ascii="Times New Roman" w:eastAsia="Times New Roman" w:hAnsi="Times New Roman" w:cs="Times New Roman"/>
+                <w:i/>
+                <w:iCs/>
+                <w:sz w:val="24"/>
+                <w:szCs w:val="24"/>
+                <w:lang w:val="it-IT"/>
+              </w:rPr>
+              <w:t>Attività:</w:t>
+            </w:r>
+            <w:r>
+              <w:rPr>
+                <w:rFonts w:ascii="Times New Roman" w:eastAsia="Times New Roman" w:hAnsi="Times New Roman" w:cs="Times New Roman"/>
+                <w:sz w:val="24"/>
+                <w:szCs w:val="24"/>
+                <w:lang w:val="it-IT"/>
+              </w:rPr>
+              <w:t xml:space="preserve"> Implementazione della pulizia automatica, standardizzazione Z-score, valutazione formale di $K$ tramite il metodo del gomito e l'indice di silhouette, addestramento del modello K-</w:t>
+            </w:r>
+            <w:proofErr w:type="spellStart"/>
+            <w:r>
+              <w:rPr>
+                <w:rFonts w:ascii="Times New Roman" w:eastAsia="Times New Roman" w:hAnsi="Times New Roman" w:cs="Times New Roman"/>
+                <w:sz w:val="24"/>
+                <w:szCs w:val="24"/>
+                <w:lang w:val="it-IT"/>
+              </w:rPr>
+              <w:t>Means</w:t>
+            </w:r>
+            <w:proofErr w:type="spellEnd"/>
+            <w:r>
+              <w:rPr>
+                <w:rFonts w:ascii="Times New Roman" w:eastAsia="Times New Roman" w:hAnsi="Times New Roman" w:cs="Times New Roman"/>
+                <w:sz w:val="24"/>
+                <w:szCs w:val="24"/>
+                <w:lang w:val="it-IT"/>
+              </w:rPr>
+              <w:t xml:space="preserve"> e confronto con i </w:t>
+            </w:r>
+            <w:proofErr w:type="spellStart"/>
+            <w:r>
+              <w:rPr>
+                <w:rFonts w:ascii="Times New Roman" w:eastAsia="Times New Roman" w:hAnsi="Times New Roman" w:cs="Times New Roman"/>
+                <w:sz w:val="24"/>
+                <w:szCs w:val="24"/>
+                <w:lang w:val="it-IT"/>
+              </w:rPr>
+              <w:t>Gaussian</w:t>
+            </w:r>
+            <w:proofErr w:type="spellEnd"/>
+            <w:r>
+              <w:rPr>
+                <w:rFonts w:ascii="Times New Roman" w:eastAsia="Times New Roman" w:hAnsi="Times New Roman" w:cs="Times New Roman"/>
+                <w:sz w:val="24"/>
+                <w:szCs w:val="24"/>
+                <w:lang w:val="it-IT"/>
+              </w:rPr>
+              <w:t xml:space="preserve"> </w:t>
+            </w:r>
+            <w:proofErr w:type="spellStart"/>
+            <w:r>
+              <w:rPr>
+                <w:rFonts w:ascii="Times New Roman" w:eastAsia="Times New Roman" w:hAnsi="Times New Roman" w:cs="Times New Roman"/>
+                <w:sz w:val="24"/>
+                <w:szCs w:val="24"/>
+                <w:lang w:val="it-IT"/>
+              </w:rPr>
+              <w:t>Mixture</w:t>
+            </w:r>
+            <w:proofErr w:type="spellEnd"/>
+            <w:r>
+              <w:rPr>
+                <w:rFonts w:ascii="Times New Roman" w:eastAsia="Times New Roman" w:hAnsi="Times New Roman" w:cs="Times New Roman"/>
+                <w:sz w:val="24"/>
+                <w:szCs w:val="24"/>
+                <w:lang w:val="it-IT"/>
+              </w:rPr>
+              <w:t xml:space="preserve"> </w:t>
+            </w:r>
+            <w:proofErr w:type="spellStart"/>
+            <w:r>
+              <w:rPr>
+                <w:rFonts w:ascii="Times New Roman" w:eastAsia="Times New Roman" w:hAnsi="Times New Roman" w:cs="Times New Roman"/>
+                <w:sz w:val="24"/>
+                <w:szCs w:val="24"/>
+                <w:lang w:val="it-IT"/>
+              </w:rPr>
+              <w:t>Models</w:t>
+            </w:r>
+            <w:proofErr w:type="spellEnd"/>
+            <w:r>
+              <w:rPr>
+                <w:rFonts w:ascii="Times New Roman" w:eastAsia="Times New Roman" w:hAnsi="Times New Roman" w:cs="Times New Roman"/>
+                <w:sz w:val="24"/>
+                <w:szCs w:val="24"/>
+                <w:lang w:val="it-IT"/>
+              </w:rPr>
+              <w:t xml:space="preserve"> (GMM). Calcolo delle metriche di validazione (</w:t>
+            </w:r>
+            <w:proofErr w:type="spellStart"/>
+            <w:r>
+              <w:rPr>
+                <w:rFonts w:ascii="Times New Roman" w:eastAsia="Times New Roman" w:hAnsi="Times New Roman" w:cs="Times New Roman"/>
+                <w:sz w:val="24"/>
+                <w:szCs w:val="24"/>
+                <w:lang w:val="it-IT"/>
+              </w:rPr>
+              <w:t>Adjusted</w:t>
+            </w:r>
+            <w:proofErr w:type="spellEnd"/>
+            <w:r>
+              <w:rPr>
+                <w:rFonts w:ascii="Times New Roman" w:eastAsia="Times New Roman" w:hAnsi="Times New Roman" w:cs="Times New Roman"/>
+                <w:sz w:val="24"/>
+                <w:szCs w:val="24"/>
+                <w:lang w:val="it-IT"/>
+              </w:rPr>
+              <w:t xml:space="preserve"> Rand Index e stabilità ai </w:t>
+            </w:r>
+            <w:proofErr w:type="spellStart"/>
+            <w:r>
+              <w:rPr>
+                <w:rFonts w:ascii="Times New Roman" w:eastAsia="Times New Roman" w:hAnsi="Times New Roman" w:cs="Times New Roman"/>
+                <w:sz w:val="24"/>
+                <w:szCs w:val="24"/>
+                <w:lang w:val="it-IT"/>
+              </w:rPr>
+              <w:t>seed</w:t>
+            </w:r>
+            <w:proofErr w:type="spellEnd"/>
+            <w:r>
+              <w:rPr>
+                <w:rFonts w:ascii="Times New Roman" w:eastAsia="Times New Roman" w:hAnsi="Times New Roman" w:cs="Times New Roman"/>
+                <w:sz w:val="24"/>
+                <w:szCs w:val="24"/>
+                <w:lang w:val="it-IT"/>
+              </w:rPr>
+              <w:t>).</w:t>
+            </w:r>
+          </w:p>
+          <w:p>
+            <w:pPr>
+              <w:numPr>
+                <w:ilvl w:val="0"/>
+                <w:numId w:val="1"/>
+              </w:numPr>
+              <w:spacing w:before="100" w:beforeAutospacing="1" w:after="100" w:afterAutospacing="1" w:line="240" w:lineRule="auto"/>
+              <w:rPr>
+                <w:rFonts w:ascii="Times New Roman" w:eastAsia="Times New Roman" w:hAnsi="Times New Roman" w:cs="Times New Roman"/>
+                <w:sz w:val="24"/>
+                <w:szCs w:val="24"/>
+                <w:lang w:val="it-IT"/>
+              </w:rPr>
+            </w:pPr>
+            <w:r>
+              <w:rPr>
+                <w:rFonts w:ascii="Times New Roman" w:eastAsia="Times New Roman" w:hAnsi="Times New Roman" w:cs="Times New Roman"/>
+                <w:b/>
+                <w:bCs/>
+                <w:sz w:val="24"/>
+                <w:szCs w:val="24"/>
+                <w:lang w:val="it-IT"/>
+              </w:rPr>
+              <w:t>Fase 4: Sviluppo della Dashboard Interattiva (3 giorni)</w:t>
+            </w:r>
+          </w:p>
+          <w:p>
+            <w:pPr>
+              <w:numPr>
+                <w:ilvl w:val="1"/>
+                <w:numId w:val="1"/>
+              </w:numPr>
+              <w:spacing w:before="100" w:beforeAutospacing="1" w:after="100" w:afterAutospacing="1" w:line="240" w:lineRule="auto"/>
+              <w:rPr>
+                <w:rFonts w:ascii="Times New Roman" w:eastAsia="Times New Roman" w:hAnsi="Times New Roman" w:cs="Times New Roman"/>
+                <w:sz w:val="24"/>
+                <w:szCs w:val="24"/>
+                <w:lang w:val="it-IT"/>
+              </w:rPr>
+            </w:pPr>
+            <w:r>
+              <w:rPr>
+                <w:rFonts w:ascii="Times New Roman" w:eastAsia="Times New Roman" w:hAnsi="Times New Roman" w:cs="Times New Roman"/>
+                <w:i/>
+                <w:iCs/>
+                <w:sz w:val="24"/>
+                <w:szCs w:val="24"/>
+                <w:lang w:val="it-IT"/>
+              </w:rPr>
+              <w:t>Attività:</w:t>
+            </w:r>
+            <w:r>
+              <w:rPr>
+                <w:rFonts w:ascii="Times New Roman" w:eastAsia="Times New Roman" w:hAnsi="Times New Roman" w:cs="Times New Roman"/>
+                <w:sz w:val="24"/>
+                <w:szCs w:val="24"/>
+                <w:lang w:val="it-IT"/>
+              </w:rPr>
+              <w:t xml:space="preserve"> Realizzazione dell'interfaccia con </w:t>
+            </w:r>
+            <w:proofErr w:type="spellStart"/>
+            <w:r>
+              <w:rPr>
+                <w:rFonts w:ascii="Times New Roman" w:eastAsia="Times New Roman" w:hAnsi="Times New Roman" w:cs="Times New Roman"/>
+                <w:sz w:val="24"/>
+                <w:szCs w:val="24"/>
+                <w:lang w:val="it-IT"/>
+              </w:rPr>
+              <w:t>Streamlit</w:t>
+            </w:r>
+            <w:proofErr w:type="spellEnd"/>
+            <w:r>
+              <w:rPr>
+                <w:rFonts w:ascii="Times New Roman" w:eastAsia="Times New Roman" w:hAnsi="Times New Roman" w:cs="Times New Roman"/>
+                <w:sz w:val="24"/>
+                <w:szCs w:val="24"/>
+                <w:lang w:val="it-IT"/>
+              </w:rPr>
+              <w:t xml:space="preserve"> e </w:t>
+            </w:r>
+            <w:proofErr w:type="spellStart"/>
+            <w:r>
+              <w:rPr>
+                <w:rFonts w:ascii="Times New Roman" w:eastAsia="Times New Roman" w:hAnsi="Times New Roman" w:cs="Times New Roman"/>
+                <w:sz w:val="24"/>
+                <w:szCs w:val="24"/>
+                <w:lang w:val="it-IT"/>
+              </w:rPr>
+              <w:t>Plotly</w:t>
+            </w:r>
+            <w:proofErr w:type="spellEnd"/>
+            <w:r>
+              <w:rPr>
+                <w:rFonts w:ascii="Times New Roman" w:eastAsia="Times New Roman" w:hAnsi="Times New Roman" w:cs="Times New Roman"/>
+                <w:sz w:val="24"/>
+                <w:szCs w:val="24"/>
+                <w:lang w:val="it-IT"/>
+              </w:rPr>
+              <w:t>. Integrazione dei filtri dinamici, delle schede di analisi dei segmenti, del modulo di classificazione in tempo reale per nuovi clienti e dell'upload batch da CSV.</w:t>
+            </w:r>
+          </w:p>
+          <w:p>
+            <w:pPr>
+              <w:numPr>
+                <w:ilvl w:val="0"/>
+                <w:numId w:val="1"/>
+              </w:numPr>
+              <w:spacing w:before="100" w:beforeAutospacing="1" w:after="100" w:afterAutospacing="1" w:line="240" w:lineRule="auto"/>
+              <w:rPr>
+                <w:rFonts w:ascii="Times New Roman" w:eastAsia="Times New Roman" w:hAnsi="Times New Roman" w:cs="Times New Roman"/>
+                <w:sz w:val="24"/>
+                <w:szCs w:val="24"/>
+                <w:lang w:val="it-IT"/>
+              </w:rPr>
+            </w:pPr>
+            <w:r>
+              <w:rPr>
+                <w:rFonts w:ascii="Times New Roman" w:eastAsia="Times New Roman" w:hAnsi="Times New Roman" w:cs="Times New Roman"/>
+                <w:b/>
+                <w:bCs/>
+                <w:sz w:val="24"/>
+                <w:szCs w:val="24"/>
+                <w:lang w:val="it-IT"/>
+              </w:rPr>
+              <w:t xml:space="preserve">Fase 5: </w:t>
+            </w:r>
+            <w:proofErr w:type="spellStart"/>
+            <w:r>
+              <w:rPr>
+                <w:rFonts w:ascii="Times New Roman" w:eastAsia="Times New Roman" w:hAnsi="Times New Roman" w:cs="Times New Roman"/>
+                <w:b/>
+                <w:bCs/>
+                <w:sz w:val="24"/>
+                <w:szCs w:val="24"/>
+                <w:lang w:val="it-IT"/>
+              </w:rPr>
+              <w:t>Testing</w:t>
+            </w:r>
+            <w:proofErr w:type="spellEnd"/>
+            <w:r>
+              <w:rPr>
+                <w:rFonts w:ascii="Times New Roman" w:eastAsia="Times New Roman" w:hAnsi="Times New Roman" w:cs="Times New Roman"/>
+                <w:b/>
+                <w:bCs/>
+                <w:sz w:val="24"/>
+                <w:szCs w:val="24"/>
+                <w:lang w:val="it-IT"/>
+              </w:rPr>
+              <w:t>, documentazione e stesura del report (2 giorni)</w:t>
+            </w:r>
+          </w:p>
+          <w:p>
+            <w:pPr>
+              <w:numPr>
+                <w:ilvl w:val="1"/>
+                <w:numId w:val="1"/>
+              </w:numPr>
+              <w:spacing w:before="100" w:beforeAutospacing="1" w:after="100" w:afterAutospacing="1" w:line="240" w:lineRule="auto"/>
+              <w:rPr>
+                <w:rFonts w:ascii="Times New Roman" w:eastAsia="Times New Roman" w:hAnsi="Times New Roman" w:cs="Times New Roman"/>
+                <w:sz w:val="24"/>
+                <w:szCs w:val="24"/>
+                <w:lang w:val="it-IT"/>
+              </w:rPr>
+            </w:pPr>
+            <w:r>
+              <w:rPr>
+                <w:rFonts w:ascii="Times New Roman" w:eastAsia="Times New Roman" w:hAnsi="Times New Roman" w:cs="Times New Roman"/>
+                <w:i/>
+                <w:iCs/>
+                <w:sz w:val="24"/>
+                <w:szCs w:val="24"/>
+                <w:lang w:val="it-IT"/>
+              </w:rPr>
+              <w:t>Attività:</w:t>
+            </w:r>
+            <w:r>
+              <w:rPr>
+                <w:rFonts w:ascii="Times New Roman" w:eastAsia="Times New Roman" w:hAnsi="Times New Roman" w:cs="Times New Roman"/>
+                <w:sz w:val="24"/>
+                <w:szCs w:val="24"/>
+                <w:lang w:val="it-IT"/>
+              </w:rPr>
+              <w:t xml:space="preserve"> Verifica dell'orchestrazione tramite script automatizzato (</w:t>
+            </w:r>
+            <w:r>
+              <w:rPr>
+                <w:rFonts w:ascii="Courier New" w:eastAsia="Times New Roman" w:hAnsi="Courier New" w:cs="Courier New"/>
+                <w:sz w:val="20"/>
+                <w:szCs w:val="20"/>
+                <w:lang w:val="it-IT"/>
+              </w:rPr>
+              <w:t>run_all.py</w:t>
+            </w:r>
+            <w:r>
+              <w:rPr>
+                <w:rFonts w:ascii="Times New Roman" w:eastAsia="Times New Roman" w:hAnsi="Times New Roman" w:cs="Times New Roman"/>
+                <w:sz w:val="24"/>
+                <w:szCs w:val="24"/>
+                <w:lang w:val="it-IT"/>
+              </w:rPr>
+              <w:t>), stesura del README e formalizzazione delle valutazioni critiche sui limiti del modello.</w:t>
             </w:r>
           </w:p>
           <w:p>
@@ -1565,6 +2250,7 @@
                 <w:lang w:val="it-IT"/>
                 <w14:ligatures w14:val="standardContextual"/>
               </w:rPr>
+              <w:lastRenderedPageBreak/>
               <w:drawing>
                 <wp:inline distT="0" distB="0" distL="0" distR="0" wp14:anchorId="7D19177C" wp14:editId="3F847FD5">
                   <wp:extent cx="5690870" cy="1016818"/>
@@ -1581,7 +2267,7 @@
                           <pic:cNvPicPr/>
                         </pic:nvPicPr>
                         <pic:blipFill>
-                          <a:blip r:embed="rId22">
+                          <a:blip r:embed="rId23">
                             <a:extLst>
                               <a:ext uri="{28A0092B-C50C-407E-A947-70E740481C1C}">
                                 <a14:useLocalDpi xmlns:a14="http://schemas.microsoft.com/office/drawing/2010/main" val="0"/>
@@ -1618,6 +2304,468 @@
           </w:tcPr>
           <w:p>
             <w:pPr>
+              <w:pStyle w:val="NormaleWeb"/>
+            </w:pPr>
+            <w:r>
+              <w:rPr>
+                <w:rFonts w:hAnsi="Symbol"/>
+              </w:rPr>
+              <w:t></w:t>
+            </w:r>
+            <w:r>
+              <w:t xml:space="preserve">  </w:t>
+            </w:r>
+            <w:r>
+              <w:rPr>
+                <w:b/>
+                <w:bCs/>
+              </w:rPr>
+              <w:t>Linguaggio di programmazione:</w:t>
+            </w:r>
+            <w:r>
+              <w:t xml:space="preserve"> </w:t>
+            </w:r>
+            <w:proofErr w:type="spellStart"/>
+            <w:r>
+              <w:t>Python</w:t>
+            </w:r>
+            <w:proofErr w:type="spellEnd"/>
+            <w:r>
+              <w:t xml:space="preserve"> (versione 3.10+).</w:t>
+            </w:r>
+          </w:p>
+          <w:p>
+            <w:pPr>
+              <w:pStyle w:val="NormaleWeb"/>
+            </w:pPr>
+            <w:r>
+              <w:rPr>
+                <w:rFonts w:hAnsi="Symbol"/>
+              </w:rPr>
+              <w:t></w:t>
+            </w:r>
+            <w:r>
+              <w:t xml:space="preserve">  </w:t>
+            </w:r>
+            <w:r>
+              <w:rPr>
+                <w:b/>
+                <w:bCs/>
+              </w:rPr>
+              <w:t>Librerie di Data Science e Machine Learning:</w:t>
+            </w:r>
+            <w:r>
+              <w:t xml:space="preserve"> </w:t>
+            </w:r>
+            <w:proofErr w:type="spellStart"/>
+            <w:r>
+              <w:t>Pandas</w:t>
+            </w:r>
+            <w:proofErr w:type="spellEnd"/>
+            <w:r>
+              <w:t xml:space="preserve"> e </w:t>
+            </w:r>
+            <w:proofErr w:type="spellStart"/>
+            <w:r>
+              <w:t>NumPy</w:t>
+            </w:r>
+            <w:proofErr w:type="spellEnd"/>
+            <w:r>
+              <w:t xml:space="preserve"> per la manipolazione matriciale e tabellare; </w:t>
+            </w:r>
+            <w:proofErr w:type="spellStart"/>
+            <w:r>
+              <w:t>Scikit-Learn</w:t>
+            </w:r>
+            <w:proofErr w:type="spellEnd"/>
+            <w:r>
+              <w:t xml:space="preserve"> per la standardizzazione (</w:t>
+            </w:r>
+            <w:proofErr w:type="spellStart"/>
+            <w:r>
+              <w:rPr>
+                <w:rStyle w:val="CodiceHTML"/>
+                <w:rFonts w:eastAsiaTheme="majorEastAsia"/>
+              </w:rPr>
+              <w:t>StandardScaler</w:t>
+            </w:r>
+            <w:proofErr w:type="spellEnd"/>
+            <w:r>
+              <w:t xml:space="preserve">), il </w:t>
+            </w:r>
+            <w:proofErr w:type="spellStart"/>
+            <w:r>
+              <w:t>clustering</w:t>
+            </w:r>
+            <w:proofErr w:type="spellEnd"/>
+            <w:r>
+              <w:t xml:space="preserve"> (</w:t>
+            </w:r>
+            <w:proofErr w:type="spellStart"/>
+            <w:r>
+              <w:rPr>
+                <w:rStyle w:val="CodiceHTML"/>
+                <w:rFonts w:eastAsiaTheme="majorEastAsia"/>
+              </w:rPr>
+              <w:t>KMeans</w:t>
+            </w:r>
+            <w:proofErr w:type="spellEnd"/>
+            <w:r>
+              <w:t xml:space="preserve">, </w:t>
+            </w:r>
+            <w:proofErr w:type="spellStart"/>
+            <w:r>
+              <w:rPr>
+                <w:rStyle w:val="CodiceHTML"/>
+                <w:rFonts w:eastAsiaTheme="majorEastAsia"/>
+              </w:rPr>
+              <w:t>GaussianMixture</w:t>
+            </w:r>
+            <w:proofErr w:type="spellEnd"/>
+            <w:r>
+              <w:t>), la riduzione dimensionali (</w:t>
+            </w:r>
+            <w:r>
+              <w:rPr>
+                <w:rStyle w:val="CodiceHTML"/>
+                <w:rFonts w:eastAsiaTheme="majorEastAsia"/>
+              </w:rPr>
+              <w:t>PCA</w:t>
+            </w:r>
+            <w:r>
+              <w:t>) e le metriche di valutazione (</w:t>
+            </w:r>
+            <w:proofErr w:type="spellStart"/>
+            <w:r>
+              <w:rPr>
+                <w:rStyle w:val="CodiceHTML"/>
+                <w:rFonts w:eastAsiaTheme="majorEastAsia"/>
+              </w:rPr>
+              <w:t>silhouette_score</w:t>
+            </w:r>
+            <w:proofErr w:type="spellEnd"/>
+            <w:r>
+              <w:t xml:space="preserve">, </w:t>
+            </w:r>
+            <w:proofErr w:type="spellStart"/>
+            <w:r>
+              <w:rPr>
+                <w:rStyle w:val="CodiceHTML"/>
+                <w:rFonts w:eastAsiaTheme="majorEastAsia"/>
+              </w:rPr>
+              <w:t>adjusted_rand_score</w:t>
+            </w:r>
+            <w:proofErr w:type="spellEnd"/>
+            <w:r>
+              <w:t>).</w:t>
+            </w:r>
+          </w:p>
+          <w:p>
+            <w:pPr>
+              <w:pStyle w:val="NormaleWeb"/>
+            </w:pPr>
+            <w:r>
+              <w:rPr>
+                <w:rFonts w:hAnsi="Symbol"/>
+              </w:rPr>
+              <w:t></w:t>
+            </w:r>
+            <w:r>
+              <w:t xml:space="preserve">  </w:t>
+            </w:r>
+            <w:r>
+              <w:rPr>
+                <w:b/>
+                <w:bCs/>
+              </w:rPr>
+              <w:t>Visualizzazione e Interfaccia:</w:t>
+            </w:r>
+            <w:r>
+              <w:t xml:space="preserve"> </w:t>
+            </w:r>
+            <w:proofErr w:type="spellStart"/>
+            <w:r>
+              <w:t>Plotly</w:t>
+            </w:r>
+            <w:proofErr w:type="spellEnd"/>
+            <w:r>
+              <w:t xml:space="preserve"> Express per la generazione di grafici interattivi multidimensionali; </w:t>
+            </w:r>
+            <w:proofErr w:type="spellStart"/>
+            <w:r>
+              <w:t>Streamlit</w:t>
+            </w:r>
+            <w:proofErr w:type="spellEnd"/>
+            <w:r>
+              <w:t xml:space="preserve"> per la costruzione della </w:t>
+            </w:r>
+            <w:proofErr w:type="spellStart"/>
+            <w:r>
+              <w:t>dashboard</w:t>
+            </w:r>
+            <w:proofErr w:type="spellEnd"/>
+            <w:r>
+              <w:t xml:space="preserve"> web.</w:t>
+            </w:r>
+          </w:p>
+          <w:p>
+            <w:pPr>
+              <w:pStyle w:val="NormaleWeb"/>
+            </w:pPr>
+            <w:r>
+              <w:rPr>
+                <w:rFonts w:hAnsi="Symbol"/>
+              </w:rPr>
+              <w:t></w:t>
+            </w:r>
+            <w:r>
+              <w:t xml:space="preserve">  </w:t>
+            </w:r>
+            <w:r>
+              <w:rPr>
+                <w:b/>
+                <w:bCs/>
+              </w:rPr>
+              <w:t>Persistenza:</w:t>
+            </w:r>
+            <w:r>
+              <w:t xml:space="preserve"> </w:t>
+            </w:r>
+            <w:proofErr w:type="spellStart"/>
+            <w:r>
+              <w:t>Joblib</w:t>
+            </w:r>
+            <w:proofErr w:type="spellEnd"/>
+            <w:r>
+              <w:t xml:space="preserve"> per il salvataggio sicuro di modelli e </w:t>
+            </w:r>
+            <w:proofErr w:type="spellStart"/>
+            <w:r>
+              <w:t>scaler</w:t>
+            </w:r>
+            <w:proofErr w:type="spellEnd"/>
+            <w:r>
+              <w:t xml:space="preserve"> (</w:t>
+            </w:r>
+            <w:r>
+              <w:rPr>
+                <w:rStyle w:val="CodiceHTML"/>
+                <w:rFonts w:eastAsiaTheme="majorEastAsia"/>
+              </w:rPr>
+              <w:t>.</w:t>
+            </w:r>
+            <w:proofErr w:type="spellStart"/>
+            <w:r>
+              <w:rPr>
+                <w:rStyle w:val="CodiceHTML"/>
+                <w:rFonts w:eastAsiaTheme="majorEastAsia"/>
+              </w:rPr>
+              <w:t>pkl</w:t>
+            </w:r>
+            <w:proofErr w:type="spellEnd"/>
+            <w:r>
+              <w:t>).</w:t>
+            </w:r>
+          </w:p>
+          <w:p>
+            <w:pPr>
+              <w:pStyle w:val="NormaleWeb"/>
+            </w:pPr>
+            <w:r>
+              <w:rPr>
+                <w:rFonts w:hAnsi="Symbol"/>
+              </w:rPr>
+              <w:t></w:t>
+            </w:r>
+            <w:r>
+              <w:t xml:space="preserve">  </w:t>
+            </w:r>
+            <w:r>
+              <w:rPr>
+                <w:b/>
+                <w:bCs/>
+              </w:rPr>
+              <w:t>Strumenti di sviluppo:</w:t>
+            </w:r>
+            <w:r>
+              <w:t xml:space="preserve"> Visual Studio Code, </w:t>
+            </w:r>
+            <w:proofErr w:type="spellStart"/>
+            <w:r>
+              <w:t>Git</w:t>
+            </w:r>
+            <w:proofErr w:type="spellEnd"/>
+            <w:r>
+              <w:t xml:space="preserve"> e </w:t>
+            </w:r>
+            <w:proofErr w:type="spellStart"/>
+            <w:r>
+              <w:t>GitHub</w:t>
+            </w:r>
+            <w:proofErr w:type="spellEnd"/>
+            <w:r>
+              <w:t xml:space="preserve"> per il </w:t>
+            </w:r>
+            <w:proofErr w:type="spellStart"/>
+            <w:r>
+              <w:t>versionamento</w:t>
+            </w:r>
+            <w:proofErr w:type="spellEnd"/>
+            <w:r>
+              <w:t xml:space="preserve"> del codice.</w:t>
+            </w:r>
+          </w:p>
+          <w:p>
+            <w:pPr>
+              <w:pStyle w:val="NormaleWeb"/>
+            </w:pPr>
+            <w:r>
+              <w:rPr>
+                <w:rFonts w:hAnsi="Symbol"/>
+              </w:rPr>
+              <w:t></w:t>
+            </w:r>
+            <w:r>
+              <w:t xml:space="preserve">  </w:t>
+            </w:r>
+            <w:r>
+              <w:rPr>
+                <w:b/>
+                <w:bCs/>
+              </w:rPr>
+              <w:t>Riferimenti bibliografici e teorici:</w:t>
+            </w:r>
+          </w:p>
+          <w:p>
+            <w:pPr>
+              <w:pStyle w:val="NormaleWeb"/>
+              <w:numPr>
+                <w:ilvl w:val="0"/>
+                <w:numId w:val="2"/>
+              </w:numPr>
+            </w:pPr>
+            <w:r>
+              <w:t xml:space="preserve">Documentazione ufficiale di </w:t>
+            </w:r>
+            <w:proofErr w:type="spellStart"/>
+            <w:r>
+              <w:t>Scikit-Learn</w:t>
+            </w:r>
+            <w:proofErr w:type="spellEnd"/>
+            <w:r>
+              <w:t xml:space="preserve"> e </w:t>
+            </w:r>
+            <w:proofErr w:type="spellStart"/>
+            <w:r>
+              <w:t>Streamlit</w:t>
+            </w:r>
+            <w:proofErr w:type="spellEnd"/>
+            <w:r>
+              <w:t>.</w:t>
+            </w:r>
+          </w:p>
+          <w:p>
+            <w:pPr>
+              <w:pStyle w:val="NormaleWeb"/>
+              <w:numPr>
+                <w:ilvl w:val="0"/>
+                <w:numId w:val="2"/>
+              </w:numPr>
+            </w:pPr>
+            <w:proofErr w:type="spellStart"/>
+            <w:r>
+              <w:rPr>
+                <w:lang w:val="en-US"/>
+              </w:rPr>
+              <w:t>Rousseeuw</w:t>
+            </w:r>
+            <w:proofErr w:type="spellEnd"/>
+            <w:r>
+              <w:rPr>
+                <w:lang w:val="en-US"/>
+              </w:rPr>
+              <w:t xml:space="preserve">, P. J. (1987). </w:t>
+            </w:r>
+            <w:r>
+              <w:rPr>
+                <w:i/>
+                <w:iCs/>
+                <w:lang w:val="en-US"/>
+              </w:rPr>
+              <w:t>Silhouettes: A graphical aid to the interpretation and validation of cluster analysis</w:t>
+            </w:r>
+            <w:r>
+              <w:rPr>
+                <w:lang w:val="en-US"/>
+              </w:rPr>
+              <w:t xml:space="preserve">. </w:t>
+            </w:r>
+            <w:r>
+              <w:t xml:space="preserve">Journal of </w:t>
+            </w:r>
+            <w:proofErr w:type="spellStart"/>
+            <w:r>
+              <w:t>Computational</w:t>
+            </w:r>
+            <w:proofErr w:type="spellEnd"/>
+            <w:r>
+              <w:t xml:space="preserve"> and </w:t>
+            </w:r>
+            <w:proofErr w:type="spellStart"/>
+            <w:r>
+              <w:t>Applied</w:t>
+            </w:r>
+            <w:proofErr w:type="spellEnd"/>
+            <w:r>
+              <w:t xml:space="preserve"> </w:t>
+            </w:r>
+            <w:proofErr w:type="spellStart"/>
+            <w:r>
+              <w:t>Mathematics</w:t>
+            </w:r>
+            <w:proofErr w:type="spellEnd"/>
+            <w:r>
+              <w:t>.</w:t>
+            </w:r>
+          </w:p>
+          <w:p>
+            <w:pPr>
+              <w:pStyle w:val="NormaleWeb"/>
+              <w:numPr>
+                <w:ilvl w:val="0"/>
+                <w:numId w:val="2"/>
+              </w:numPr>
+            </w:pPr>
+            <w:r>
+              <w:t>Framework RFM (</w:t>
+            </w:r>
+            <w:proofErr w:type="spellStart"/>
+            <w:r>
+              <w:t>Recency</w:t>
+            </w:r>
+            <w:proofErr w:type="spellEnd"/>
+            <w:r>
+              <w:t xml:space="preserve">, </w:t>
+            </w:r>
+            <w:proofErr w:type="spellStart"/>
+            <w:r>
+              <w:t>Frequency</w:t>
+            </w:r>
+            <w:proofErr w:type="spellEnd"/>
+            <w:r>
+              <w:t xml:space="preserve">, </w:t>
+            </w:r>
+            <w:proofErr w:type="spellStart"/>
+            <w:r>
+              <w:t>Monetary</w:t>
+            </w:r>
+            <w:proofErr w:type="spellEnd"/>
+            <w:r>
+              <w:t>) ampiamente validato nella letteratura di marketing analitico.</w:t>
+            </w:r>
+          </w:p>
+          <w:p>
+            <w:pPr>
               <w:jc w:val="both"/>
               <w:rPr>
                 <w:rFonts w:ascii="Times New Roman" w:hAnsi="Times New Roman" w:cs="Times New Roman"/>
@@ -1671,6 +2819,7 @@
                 <w:lang w:val="it-IT"/>
                 <w14:ligatures w14:val="standardContextual"/>
               </w:rPr>
+              <w:lastRenderedPageBreak/>
               <w:drawing>
                 <wp:inline distT="0" distB="0" distL="0" distR="0" wp14:anchorId="44DB15A7" wp14:editId="0ED393D1">
                   <wp:extent cx="4236244" cy="175044"/>
@@ -1687,7 +2836,7 @@
                           <pic:cNvPicPr/>
                         </pic:nvPicPr>
                         <pic:blipFill>
-                          <a:blip r:embed="rId23">
+                          <a:blip r:embed="rId24">
                             <a:extLst>
                               <a:ext uri="{28A0092B-C50C-407E-A947-70E740481C1C}">
                                 <a14:useLocalDpi xmlns:a14="http://schemas.microsoft.com/office/drawing/2010/main" val="0"/>
@@ -1759,7 +2908,7 @@
                           <pic:cNvPicPr/>
                         </pic:nvPicPr>
                         <pic:blipFill>
-                          <a:blip r:embed="rId24">
+                          <a:blip r:embed="rId25">
                             <a:extLst>
                               <a:ext uri="{28A0092B-C50C-407E-A947-70E740481C1C}">
                                 <a14:useLocalDpi xmlns:a14="http://schemas.microsoft.com/office/drawing/2010/main" val="0"/>
@@ -1796,24 +2945,186 @@
           </w:tcPr>
           <w:p>
             <w:pPr>
-              <w:jc w:val="both"/>
-              <w:rPr>
-                <w:rFonts w:ascii="Times New Roman" w:hAnsi="Times New Roman" w:cs="Times New Roman"/>
-                <w:sz w:val="28"/>
-                <w:szCs w:val="28"/>
-                <w:lang w:val="it-IT"/>
-              </w:rPr>
-            </w:pPr>
-            <w:r>
-              <w:rPr>
-                <w:rFonts w:ascii="Times New Roman" w:hAnsi="Times New Roman" w:cs="Times New Roman"/>
-                <w:color w:val="FF0000"/>
-                <w:sz w:val="24"/>
-                <w:szCs w:val="24"/>
-                <w:lang w:val="it-IT"/>
-              </w:rPr>
-              <w:lastRenderedPageBreak/>
-              <w:t>Inserisci qui il testo</w:t>
+              <w:pStyle w:val="NormaleWeb"/>
+            </w:pPr>
+            <w:r>
+              <w:t xml:space="preserve">L'elaborato si pone l'obiettivo di realizzare un prototipo funzionale di segmentazione comportamentale della clientela basato sul modello </w:t>
+            </w:r>
+            <w:r>
+              <w:rPr>
+                <w:b/>
+                <w:bCs/>
+              </w:rPr>
+              <w:t>RFM</w:t>
+            </w:r>
+            <w:r>
+              <w:t xml:space="preserve"> (</w:t>
+            </w:r>
+            <w:proofErr w:type="spellStart"/>
+            <w:r>
+              <w:t>Recency</w:t>
+            </w:r>
+            <w:proofErr w:type="spellEnd"/>
+            <w:r>
+              <w:t xml:space="preserve">, </w:t>
+            </w:r>
+            <w:proofErr w:type="spellStart"/>
+            <w:r>
+              <w:t>Frequency</w:t>
+            </w:r>
+            <w:proofErr w:type="spellEnd"/>
+            <w:r>
+              <w:t xml:space="preserve">, </w:t>
+            </w:r>
+            <w:proofErr w:type="spellStart"/>
+            <w:r>
+              <w:t>Monetary</w:t>
+            </w:r>
+            <w:proofErr w:type="spellEnd"/>
+            <w:r>
+              <w:t>) applicando algoritmi di apprendimento non supervisionato. Gli obiettivi specifici comprendono:</w:t>
+            </w:r>
+          </w:p>
+          <w:p>
+            <w:pPr>
+              <w:pStyle w:val="NormaleWeb"/>
+              <w:numPr>
+                <w:ilvl w:val="0"/>
+                <w:numId w:val="3"/>
+              </w:numPr>
+            </w:pPr>
+            <w:r>
+              <w:t xml:space="preserve">Generare un </w:t>
+            </w:r>
+            <w:proofErr w:type="spellStart"/>
+            <w:r>
+              <w:t>dataset</w:t>
+            </w:r>
+            <w:proofErr w:type="spellEnd"/>
+            <w:r>
+              <w:t xml:space="preserve"> di almeno 500 record con distribuzioni realistiche e sovrapposizioni comportamentali.</w:t>
+            </w:r>
+          </w:p>
+          <w:p>
+            <w:pPr>
+              <w:pStyle w:val="NormaleWeb"/>
+              <w:numPr>
+                <w:ilvl w:val="0"/>
+                <w:numId w:val="3"/>
+              </w:numPr>
+            </w:pPr>
+            <w:r>
+              <w:t xml:space="preserve">Strutturare una pipeline di pulizia robusta in grado di gestire valori mancanti, duplicati e </w:t>
+            </w:r>
+            <w:proofErr w:type="spellStart"/>
+            <w:r>
+              <w:t>outlier</w:t>
+            </w:r>
+            <w:proofErr w:type="spellEnd"/>
+            <w:r>
+              <w:t>.</w:t>
+            </w:r>
+          </w:p>
+          <w:p>
+            <w:pPr>
+              <w:pStyle w:val="NormaleWeb"/>
+              <w:numPr>
+                <w:ilvl w:val="0"/>
+                <w:numId w:val="3"/>
+              </w:numPr>
+            </w:pPr>
+            <w:r>
+              <w:t>Determinare in modo rigoroso e motivato il numero ottimale di cluster (</w:t>
+            </w:r>
+            <w:r>
+              <w:rPr>
+                <w:rStyle w:val="math-inline"/>
+                <w:rFonts w:eastAsiaTheme="majorEastAsia"/>
+              </w:rPr>
+              <w:t>$K$</w:t>
+            </w:r>
+            <w:r>
+              <w:t>).</w:t>
+            </w:r>
+          </w:p>
+          <w:p>
+            <w:pPr>
+              <w:pStyle w:val="NormaleWeb"/>
+              <w:numPr>
+                <w:ilvl w:val="0"/>
+                <w:numId w:val="3"/>
+              </w:numPr>
+            </w:pPr>
+            <w:r>
+              <w:t xml:space="preserve">Applicare un sistema di etichettatura automatica dei segmenti basato sui </w:t>
+            </w:r>
+            <w:proofErr w:type="spellStart"/>
+            <w:r>
+              <w:t>centroidi</w:t>
+            </w:r>
+            <w:proofErr w:type="spellEnd"/>
+            <w:r>
+              <w:t xml:space="preserve"> (es. </w:t>
+            </w:r>
+            <w:r>
+              <w:rPr>
+                <w:i/>
+                <w:iCs/>
+              </w:rPr>
+              <w:t>Campioni</w:t>
+            </w:r>
+            <w:r>
+              <w:t xml:space="preserve">, </w:t>
+            </w:r>
+            <w:r>
+              <w:rPr>
+                <w:i/>
+                <w:iCs/>
+              </w:rPr>
+              <w:t>Fedeli</w:t>
+            </w:r>
+            <w:r>
+              <w:t xml:space="preserve">, </w:t>
+            </w:r>
+            <w:r>
+              <w:rPr>
+                <w:i/>
+                <w:iCs/>
+              </w:rPr>
+              <w:t>A Rischio</w:t>
+            </w:r>
+            <w:r>
+              <w:t xml:space="preserve">, </w:t>
+            </w:r>
+            <w:r>
+              <w:rPr>
+                <w:i/>
+                <w:iCs/>
+              </w:rPr>
+              <w:t>Nuovi</w:t>
+            </w:r>
+            <w:r>
+              <w:t>).</w:t>
+            </w:r>
+          </w:p>
+          <w:p>
+            <w:pPr>
+              <w:pStyle w:val="NormaleWeb"/>
+              <w:numPr>
+                <w:ilvl w:val="0"/>
+                <w:numId w:val="3"/>
+              </w:numPr>
+            </w:pPr>
+            <w:r>
+              <w:t xml:space="preserve">Sviluppare una </w:t>
+            </w:r>
+            <w:proofErr w:type="spellStart"/>
+            <w:r>
+              <w:t>dashboard</w:t>
+            </w:r>
+            <w:proofErr w:type="spellEnd"/>
+            <w:r>
+              <w:t xml:space="preserve"> interattiva che consenta il filtraggio dei dati, la classificazione istantanea di nuovi clienti senza riaddestramento del modello e l'analisi comparativa delle performance.</w:t>
             </w:r>
           </w:p>
           <w:p>
@@ -1868,7 +3179,7 @@
                           <pic:cNvPicPr/>
                         </pic:nvPicPr>
                         <pic:blipFill>
-                          <a:blip r:embed="rId25">
+                          <a:blip r:embed="rId26">
                             <a:extLst>
                               <a:ext uri="{28A0092B-C50C-407E-A947-70E740481C1C}">
                                 <a14:useLocalDpi xmlns:a14="http://schemas.microsoft.com/office/drawing/2010/main" val="0"/>
@@ -1905,23 +3216,230 @@
           </w:tcPr>
           <w:p>
             <w:pPr>
-              <w:jc w:val="both"/>
-              <w:rPr>
-                <w:rFonts w:ascii="Times New Roman" w:hAnsi="Times New Roman" w:cs="Times New Roman"/>
-                <w:sz w:val="28"/>
-                <w:szCs w:val="28"/>
-                <w:lang w:val="it-IT"/>
-              </w:rPr>
-            </w:pPr>
-            <w:r>
-              <w:rPr>
-                <w:rFonts w:ascii="Times New Roman" w:hAnsi="Times New Roman" w:cs="Times New Roman"/>
-                <w:color w:val="FF0000"/>
-                <w:sz w:val="24"/>
-                <w:szCs w:val="24"/>
-                <w:lang w:val="it-IT"/>
-              </w:rPr>
-              <w:t>Inserisci qui il testo</w:t>
+              <w:spacing w:before="100" w:beforeAutospacing="1" w:after="100" w:afterAutospacing="1" w:line="240" w:lineRule="auto"/>
+              <w:rPr>
+                <w:rFonts w:ascii="Times New Roman" w:eastAsia="Times New Roman" w:hAnsi="Times New Roman" w:cs="Times New Roman"/>
+                <w:sz w:val="24"/>
+                <w:szCs w:val="24"/>
+                <w:lang w:val="it-IT"/>
+              </w:rPr>
+            </w:pPr>
+            <w:r>
+              <w:rPr>
+                <w:rFonts w:ascii="Times New Roman" w:eastAsia="Times New Roman" w:hAnsi="Symbol" w:cs="Times New Roman"/>
+                <w:sz w:val="24"/>
+                <w:szCs w:val="24"/>
+                <w:lang w:val="it-IT"/>
+              </w:rPr>
+              <w:t></w:t>
+            </w:r>
+            <w:r>
+              <w:rPr>
+                <w:rFonts w:ascii="Times New Roman" w:eastAsia="Times New Roman" w:hAnsi="Times New Roman" w:cs="Times New Roman"/>
+                <w:sz w:val="24"/>
+                <w:szCs w:val="24"/>
+                <w:lang w:val="it-IT"/>
+              </w:rPr>
+              <w:t xml:space="preserve">  </w:t>
+            </w:r>
+            <w:r>
+              <w:rPr>
+                <w:rFonts w:ascii="Times New Roman" w:eastAsia="Times New Roman" w:hAnsi="Times New Roman" w:cs="Times New Roman"/>
+                <w:b/>
+                <w:bCs/>
+                <w:sz w:val="24"/>
+                <w:szCs w:val="24"/>
+                <w:lang w:val="it-IT"/>
+              </w:rPr>
+              <w:t>Contesto teorico:</w:t>
+            </w:r>
+            <w:r>
+              <w:rPr>
+                <w:rFonts w:ascii="Times New Roman" w:eastAsia="Times New Roman" w:hAnsi="Times New Roman" w:cs="Times New Roman"/>
+                <w:sz w:val="24"/>
+                <w:szCs w:val="24"/>
+                <w:lang w:val="it-IT"/>
+              </w:rPr>
+              <w:t xml:space="preserve"> Il </w:t>
+            </w:r>
+            <w:proofErr w:type="spellStart"/>
+            <w:r>
+              <w:rPr>
+                <w:rFonts w:ascii="Times New Roman" w:eastAsia="Times New Roman" w:hAnsi="Times New Roman" w:cs="Times New Roman"/>
+                <w:sz w:val="24"/>
+                <w:szCs w:val="24"/>
+                <w:lang w:val="it-IT"/>
+              </w:rPr>
+              <w:t>clustering</w:t>
+            </w:r>
+            <w:proofErr w:type="spellEnd"/>
+            <w:r>
+              <w:rPr>
+                <w:rFonts w:ascii="Times New Roman" w:eastAsia="Times New Roman" w:hAnsi="Times New Roman" w:cs="Times New Roman"/>
+                <w:sz w:val="24"/>
+                <w:szCs w:val="24"/>
+                <w:lang w:val="it-IT"/>
+              </w:rPr>
+              <w:t xml:space="preserve"> non supervisionato permette di raggruppare osservazioni non etichettate in base alla loro somiglianza geometrica nello spazio delle </w:t>
+            </w:r>
+            <w:proofErr w:type="spellStart"/>
+            <w:r>
+              <w:rPr>
+                <w:rFonts w:ascii="Times New Roman" w:eastAsia="Times New Roman" w:hAnsi="Times New Roman" w:cs="Times New Roman"/>
+                <w:sz w:val="24"/>
+                <w:szCs w:val="24"/>
+                <w:lang w:val="it-IT"/>
+              </w:rPr>
+              <w:t>feature</w:t>
+            </w:r>
+            <w:proofErr w:type="spellEnd"/>
+            <w:r>
+              <w:rPr>
+                <w:rFonts w:ascii="Times New Roman" w:eastAsia="Times New Roman" w:hAnsi="Times New Roman" w:cs="Times New Roman"/>
+                <w:sz w:val="24"/>
+                <w:szCs w:val="24"/>
+                <w:lang w:val="it-IT"/>
+              </w:rPr>
+              <w:t>. In ambito marketing, l'analisi RFM misura rispettivamente la freschezza dell'ultimo acquisto, la frequenza delle transazioni e il valore economico generato, offrendo una fotografia precisa del valore del cliente (</w:t>
+            </w:r>
+            <w:proofErr w:type="spellStart"/>
+            <w:r>
+              <w:rPr>
+                <w:rFonts w:ascii="Times New Roman" w:eastAsia="Times New Roman" w:hAnsi="Times New Roman" w:cs="Times New Roman"/>
+                <w:i/>
+                <w:iCs/>
+                <w:sz w:val="24"/>
+                <w:szCs w:val="24"/>
+                <w:lang w:val="it-IT"/>
+              </w:rPr>
+              <w:t>Customer</w:t>
+            </w:r>
+            <w:proofErr w:type="spellEnd"/>
+            <w:r>
+              <w:rPr>
+                <w:rFonts w:ascii="Times New Roman" w:eastAsia="Times New Roman" w:hAnsi="Times New Roman" w:cs="Times New Roman"/>
+                <w:i/>
+                <w:iCs/>
+                <w:sz w:val="24"/>
+                <w:szCs w:val="24"/>
+                <w:lang w:val="it-IT"/>
+              </w:rPr>
+              <w:t xml:space="preserve"> </w:t>
+            </w:r>
+            <w:proofErr w:type="spellStart"/>
+            <w:r>
+              <w:rPr>
+                <w:rFonts w:ascii="Times New Roman" w:eastAsia="Times New Roman" w:hAnsi="Times New Roman" w:cs="Times New Roman"/>
+                <w:i/>
+                <w:iCs/>
+                <w:sz w:val="24"/>
+                <w:szCs w:val="24"/>
+                <w:lang w:val="it-IT"/>
+              </w:rPr>
+              <w:t>Lifetime</w:t>
+            </w:r>
+            <w:proofErr w:type="spellEnd"/>
+            <w:r>
+              <w:rPr>
+                <w:rFonts w:ascii="Times New Roman" w:eastAsia="Times New Roman" w:hAnsi="Times New Roman" w:cs="Times New Roman"/>
+                <w:i/>
+                <w:iCs/>
+                <w:sz w:val="24"/>
+                <w:szCs w:val="24"/>
+                <w:lang w:val="it-IT"/>
+              </w:rPr>
+              <w:t xml:space="preserve"> Value</w:t>
+            </w:r>
+            <w:r>
+              <w:rPr>
+                <w:rFonts w:ascii="Times New Roman" w:eastAsia="Times New Roman" w:hAnsi="Times New Roman" w:cs="Times New Roman"/>
+                <w:sz w:val="24"/>
+                <w:szCs w:val="24"/>
+                <w:lang w:val="it-IT"/>
+              </w:rPr>
+              <w:t>).</w:t>
+            </w:r>
+          </w:p>
+          <w:p>
+            <w:pPr>
+              <w:spacing w:before="100" w:beforeAutospacing="1" w:after="100" w:afterAutospacing="1" w:line="240" w:lineRule="auto"/>
+              <w:rPr>
+                <w:rFonts w:ascii="Times New Roman" w:eastAsia="Times New Roman" w:hAnsi="Times New Roman" w:cs="Times New Roman"/>
+                <w:sz w:val="24"/>
+                <w:szCs w:val="24"/>
+                <w:lang w:val="it-IT"/>
+              </w:rPr>
+            </w:pPr>
+            <w:r>
+              <w:rPr>
+                <w:rFonts w:ascii="Times New Roman" w:eastAsia="Times New Roman" w:hAnsi="Symbol" w:cs="Times New Roman"/>
+                <w:sz w:val="24"/>
+                <w:szCs w:val="24"/>
+                <w:lang w:val="it-IT"/>
+              </w:rPr>
+              <w:t></w:t>
+            </w:r>
+            <w:r>
+              <w:rPr>
+                <w:rFonts w:ascii="Times New Roman" w:eastAsia="Times New Roman" w:hAnsi="Times New Roman" w:cs="Times New Roman"/>
+                <w:sz w:val="24"/>
+                <w:szCs w:val="24"/>
+                <w:lang w:val="it-IT"/>
+              </w:rPr>
+              <w:t xml:space="preserve">  </w:t>
+            </w:r>
+            <w:r>
+              <w:rPr>
+                <w:rFonts w:ascii="Times New Roman" w:eastAsia="Times New Roman" w:hAnsi="Times New Roman" w:cs="Times New Roman"/>
+                <w:b/>
+                <w:bCs/>
+                <w:sz w:val="24"/>
+                <w:szCs w:val="24"/>
+                <w:lang w:val="it-IT"/>
+              </w:rPr>
+              <w:t>Contesto applicativo:</w:t>
+            </w:r>
+            <w:r>
+              <w:rPr>
+                <w:rFonts w:ascii="Times New Roman" w:eastAsia="Times New Roman" w:hAnsi="Times New Roman" w:cs="Times New Roman"/>
+                <w:sz w:val="24"/>
+                <w:szCs w:val="24"/>
+                <w:lang w:val="it-IT"/>
+              </w:rPr>
+              <w:t xml:space="preserve"> Startup digitali e aziende di servizi on-demand che necessitano di superare logiche di marketing indifferenziato per adottare strategie di comunicazione mirate, programmi fedeltà personalizzati e campagne di recupero (</w:t>
+            </w:r>
+            <w:proofErr w:type="spellStart"/>
+            <w:r>
+              <w:rPr>
+                <w:rFonts w:ascii="Times New Roman" w:eastAsia="Times New Roman" w:hAnsi="Times New Roman" w:cs="Times New Roman"/>
+                <w:i/>
+                <w:iCs/>
+                <w:sz w:val="24"/>
+                <w:szCs w:val="24"/>
+                <w:lang w:val="it-IT"/>
+              </w:rPr>
+              <w:t>win</w:t>
+            </w:r>
+            <w:proofErr w:type="spellEnd"/>
+            <w:r>
+              <w:rPr>
+                <w:rFonts w:ascii="Times New Roman" w:eastAsia="Times New Roman" w:hAnsi="Times New Roman" w:cs="Times New Roman"/>
+                <w:i/>
+                <w:iCs/>
+                <w:sz w:val="24"/>
+                <w:szCs w:val="24"/>
+                <w:lang w:val="it-IT"/>
+              </w:rPr>
+              <w:t>-back</w:t>
+            </w:r>
+            <w:r>
+              <w:rPr>
+                <w:rFonts w:ascii="Times New Roman" w:eastAsia="Times New Roman" w:hAnsi="Times New Roman" w:cs="Times New Roman"/>
+                <w:sz w:val="24"/>
+                <w:szCs w:val="24"/>
+                <w:lang w:val="it-IT"/>
+              </w:rPr>
+              <w:t>) per i clienti a rischio di abbandono.</w:t>
             </w:r>
           </w:p>
           <w:p>
@@ -1980,7 +3498,7 @@
                           <pic:cNvPicPr/>
                         </pic:nvPicPr>
                         <pic:blipFill>
-                          <a:blip r:embed="rId26">
+                          <a:blip r:embed="rId27">
                             <a:extLst>
                               <a:ext uri="{28A0092B-C50C-407E-A947-70E740481C1C}">
                                 <a14:useLocalDpi xmlns:a14="http://schemas.microsoft.com/office/drawing/2010/main" val="0"/>
@@ -2017,23 +3535,316 @@
           </w:tcPr>
           <w:p>
             <w:pPr>
-              <w:jc w:val="both"/>
-              <w:rPr>
-                <w:rFonts w:ascii="Times New Roman" w:hAnsi="Times New Roman" w:cs="Times New Roman"/>
-                <w:sz w:val="28"/>
-                <w:szCs w:val="28"/>
-                <w:lang w:val="it-IT"/>
-              </w:rPr>
-            </w:pPr>
-            <w:r>
-              <w:rPr>
-                <w:rFonts w:ascii="Times New Roman" w:hAnsi="Times New Roman" w:cs="Times New Roman"/>
-                <w:color w:val="FF0000"/>
-                <w:sz w:val="24"/>
-                <w:szCs w:val="24"/>
-                <w:lang w:val="it-IT"/>
-              </w:rPr>
-              <w:t>Inserisci qui il testo</w:t>
+              <w:pStyle w:val="NormaleWeb"/>
+            </w:pPr>
+            <w:r>
+              <w:t>Il progetto è stato sviluppato seguendo un'architettura software pulita e componibile:</w:t>
+            </w:r>
+          </w:p>
+          <w:p>
+            <w:pPr>
+              <w:pStyle w:val="NormaleWeb"/>
+              <w:numPr>
+                <w:ilvl w:val="0"/>
+                <w:numId w:val="4"/>
+              </w:numPr>
+            </w:pPr>
+            <w:r>
+              <w:rPr>
+                <w:b/>
+                <w:bCs/>
+              </w:rPr>
+              <w:t>Generazione e Pulizia (</w:t>
+            </w:r>
+            <w:r>
+              <w:rPr>
+                <w:rStyle w:val="CodiceHTML"/>
+                <w:rFonts w:eastAsiaTheme="majorEastAsia"/>
+                <w:b/>
+                <w:bCs/>
+              </w:rPr>
+              <w:t>data_generator.py</w:t>
+            </w:r>
+            <w:r>
+              <w:rPr>
+                <w:b/>
+                <w:bCs/>
+              </w:rPr>
+              <w:t xml:space="preserve"> e </w:t>
+            </w:r>
+            <w:r>
+              <w:rPr>
+                <w:rStyle w:val="CodiceHTML"/>
+                <w:rFonts w:eastAsiaTheme="majorEastAsia"/>
+                <w:b/>
+                <w:bCs/>
+              </w:rPr>
+              <w:t>clustering_pipeline.py</w:t>
+            </w:r>
+            <w:r>
+              <w:rPr>
+                <w:b/>
+                <w:bCs/>
+              </w:rPr>
+              <w:t>):</w:t>
+            </w:r>
+            <w:r>
+              <w:t xml:space="preserve"> Il </w:t>
+            </w:r>
+            <w:proofErr w:type="spellStart"/>
+            <w:r>
+              <w:t>dataset</w:t>
+            </w:r>
+            <w:proofErr w:type="spellEnd"/>
+            <w:r>
+              <w:t xml:space="preserve"> viene generato introducendo rumore gaussiano per evitare separazioni artificiali. La fase di pulizia rimuove i duplicati, imputa i valori mancanti con la mediana (robusta agli </w:t>
+            </w:r>
+            <w:proofErr w:type="spellStart"/>
+            <w:r>
+              <w:t>outlier</w:t>
+            </w:r>
+            <w:proofErr w:type="spellEnd"/>
+            <w:r>
+              <w:t xml:space="preserve">) e applica un </w:t>
+            </w:r>
+            <w:proofErr w:type="spellStart"/>
+            <w:r>
+              <w:t>capping</w:t>
+            </w:r>
+            <w:proofErr w:type="spellEnd"/>
+            <w:r>
+              <w:t xml:space="preserve"> al 99° percentile sull'importo medio per evitare distorsioni nel modello.</w:t>
+            </w:r>
+          </w:p>
+          <w:p>
+            <w:pPr>
+              <w:pStyle w:val="NormaleWeb"/>
+              <w:numPr>
+                <w:ilvl w:val="0"/>
+                <w:numId w:val="4"/>
+              </w:numPr>
+            </w:pPr>
+            <w:r>
+              <w:rPr>
+                <w:b/>
+                <w:bCs/>
+              </w:rPr>
+              <w:t xml:space="preserve">Selezione di </w:t>
+            </w:r>
+            <w:r>
+              <w:rPr>
+                <w:rStyle w:val="math-inline"/>
+                <w:rFonts w:eastAsiaTheme="majorEastAsia"/>
+                <w:b/>
+                <w:bCs/>
+              </w:rPr>
+              <w:t>$K$</w:t>
+            </w:r>
+            <w:r>
+              <w:rPr>
+                <w:b/>
+                <w:bCs/>
+              </w:rPr>
+              <w:t xml:space="preserve"> e Modello:</w:t>
+            </w:r>
+            <w:r>
+              <w:t xml:space="preserve"> Mediante l'analisi combinata del metodo del gomito e dell'indice di silhouette, viene selezionato il valore ottimale di </w:t>
+            </w:r>
+            <w:r>
+              <w:rPr>
+                <w:rStyle w:val="math-inline"/>
+                <w:rFonts w:eastAsiaTheme="majorEastAsia"/>
+              </w:rPr>
+              <w:t>$K$</w:t>
+            </w:r>
+            <w:r>
+              <w:t xml:space="preserve"> (pari a 4). L'addestramento del K-</w:t>
+            </w:r>
+            <w:proofErr w:type="spellStart"/>
+            <w:r>
+              <w:t>Means</w:t>
+            </w:r>
+            <w:proofErr w:type="spellEnd"/>
+            <w:r>
+              <w:t xml:space="preserve"> viene affiancato da un confronto con i </w:t>
+            </w:r>
+            <w:proofErr w:type="spellStart"/>
+            <w:r>
+              <w:t>Gaussian</w:t>
+            </w:r>
+            <w:proofErr w:type="spellEnd"/>
+            <w:r>
+              <w:t xml:space="preserve"> </w:t>
+            </w:r>
+            <w:proofErr w:type="spellStart"/>
+            <w:r>
+              <w:t>Mixture</w:t>
+            </w:r>
+            <w:proofErr w:type="spellEnd"/>
+            <w:r>
+              <w:t xml:space="preserve"> </w:t>
+            </w:r>
+            <w:proofErr w:type="spellStart"/>
+            <w:r>
+              <w:t>Models</w:t>
+            </w:r>
+            <w:proofErr w:type="spellEnd"/>
+            <w:r>
+              <w:t xml:space="preserve"> (GMM) per valutarne la robustezza.</w:t>
+            </w:r>
+          </w:p>
+          <w:p>
+            <w:pPr>
+              <w:pStyle w:val="NormaleWeb"/>
+              <w:numPr>
+                <w:ilvl w:val="0"/>
+                <w:numId w:val="4"/>
+              </w:numPr>
+            </w:pPr>
+            <w:r>
+              <w:rPr>
+                <w:b/>
+                <w:bCs/>
+              </w:rPr>
+              <w:t xml:space="preserve">Mappatura dei </w:t>
+            </w:r>
+            <w:proofErr w:type="spellStart"/>
+            <w:r>
+              <w:rPr>
+                <w:b/>
+                <w:bCs/>
+              </w:rPr>
+              <w:t>Centroidi</w:t>
+            </w:r>
+            <w:proofErr w:type="spellEnd"/>
+            <w:r>
+              <w:rPr>
+                <w:b/>
+                <w:bCs/>
+              </w:rPr>
+              <w:t>:</w:t>
+            </w:r>
+            <w:r>
+              <w:t xml:space="preserve"> Viene eseguita un'etichettatura logica e univoca dei cluster basata sui valori medi dei </w:t>
+            </w:r>
+            <w:proofErr w:type="spellStart"/>
+            <w:r>
+              <w:t>centroidi</w:t>
+            </w:r>
+            <w:proofErr w:type="spellEnd"/>
+            <w:r>
+              <w:t xml:space="preserve"> (es. elevata frequenza e spesa elevata identificano i </w:t>
+            </w:r>
+            <w:r>
+              <w:rPr>
+                <w:i/>
+                <w:iCs/>
+              </w:rPr>
+              <w:t>Campioni</w:t>
+            </w:r>
+            <w:r>
+              <w:t xml:space="preserve">; alta </w:t>
+            </w:r>
+            <w:proofErr w:type="spellStart"/>
+            <w:r>
+              <w:t>recency</w:t>
+            </w:r>
+            <w:proofErr w:type="spellEnd"/>
+            <w:r>
+              <w:t xml:space="preserve"> individua i clienti </w:t>
+            </w:r>
+            <w:r>
+              <w:rPr>
+                <w:i/>
+                <w:iCs/>
+              </w:rPr>
+              <w:t>A Rischio</w:t>
+            </w:r>
+            <w:r>
+              <w:t>).</w:t>
+            </w:r>
+          </w:p>
+          <w:p>
+            <w:pPr>
+              <w:pStyle w:val="NormaleWeb"/>
+              <w:numPr>
+                <w:ilvl w:val="0"/>
+                <w:numId w:val="4"/>
+              </w:numPr>
+            </w:pPr>
+            <w:r>
+              <w:rPr>
+                <w:b/>
+                <w:bCs/>
+              </w:rPr>
+              <w:t>Dashboard e Persistenza (</w:t>
+            </w:r>
+            <w:r>
+              <w:rPr>
+                <w:rStyle w:val="CodiceHTML"/>
+                <w:rFonts w:eastAsiaTheme="majorEastAsia"/>
+                <w:b/>
+                <w:bCs/>
+              </w:rPr>
+              <w:t>dashboard.py</w:t>
+            </w:r>
+            <w:r>
+              <w:rPr>
+                <w:b/>
+                <w:bCs/>
+              </w:rPr>
+              <w:t>):</w:t>
+            </w:r>
+            <w:r>
+              <w:t xml:space="preserve"> Grazie all'utilizzo di artefatti salvati (</w:t>
+            </w:r>
+            <w:proofErr w:type="spellStart"/>
+            <w:r>
+              <w:rPr>
+                <w:rStyle w:val="CodiceHTML"/>
+                <w:rFonts w:eastAsiaTheme="majorEastAsia"/>
+              </w:rPr>
+              <w:t>scaler.pkl</w:t>
+            </w:r>
+            <w:proofErr w:type="spellEnd"/>
+            <w:r>
+              <w:t xml:space="preserve">, </w:t>
+            </w:r>
+            <w:proofErr w:type="spellStart"/>
+            <w:r>
+              <w:rPr>
+                <w:rStyle w:val="CodiceHTML"/>
+                <w:rFonts w:eastAsiaTheme="majorEastAsia"/>
+              </w:rPr>
+              <w:t>kmeans.pkl</w:t>
+            </w:r>
+            <w:proofErr w:type="spellEnd"/>
+            <w:r>
+              <w:t xml:space="preserve">, </w:t>
+            </w:r>
+            <w:proofErr w:type="spellStart"/>
+            <w:r>
+              <w:rPr>
+                <w:rStyle w:val="CodiceHTML"/>
+                <w:rFonts w:eastAsiaTheme="majorEastAsia"/>
+              </w:rPr>
+              <w:t>pca.pkl</w:t>
+            </w:r>
+            <w:proofErr w:type="spellEnd"/>
+            <w:r>
+              <w:t xml:space="preserve">), la </w:t>
+            </w:r>
+            <w:proofErr w:type="spellStart"/>
+            <w:r>
+              <w:t>dashboard</w:t>
+            </w:r>
+            <w:proofErr w:type="spellEnd"/>
+            <w:r>
+              <w:t xml:space="preserve"> classifica nuovi record in tempo reale </w:t>
+            </w:r>
+            <w:r>
+              <w:lastRenderedPageBreak/>
+              <w:t>eseguendo esclusivamente la proiezione e la predizione, azzerando i rischi di instabilità e riducendo a zero il tempo di calcolo.</w:t>
             </w:r>
           </w:p>
           <w:p>
@@ -2076,6 +3887,7 @@
                 <w:lang w:val="it-IT"/>
                 <w14:ligatures w14:val="standardContextual"/>
               </w:rPr>
+              <w:lastRenderedPageBreak/>
               <w:drawing>
                 <wp:inline distT="0" distB="0" distL="0" distR="0" wp14:anchorId="10FA6396" wp14:editId="0747D029">
                   <wp:extent cx="5607843" cy="561832"/>
@@ -2092,7 +3904,7 @@
                           <pic:cNvPicPr/>
                         </pic:nvPicPr>
                         <pic:blipFill>
-                          <a:blip r:embed="rId27">
+                          <a:blip r:embed="rId28">
                             <a:extLst>
                               <a:ext uri="{28A0092B-C50C-407E-A947-70E740481C1C}">
                                 <a14:useLocalDpi xmlns:a14="http://schemas.microsoft.com/office/drawing/2010/main" val="0"/>
@@ -2129,6 +3941,123 @@
           </w:tcPr>
           <w:p>
             <w:pPr>
+              <w:pStyle w:val="NormaleWeb"/>
+            </w:pPr>
+            <w:r>
+              <w:t xml:space="preserve">Il sistema di segmentazione progettato trova applicazione diretta nei settori dell'e-commerce, del </w:t>
+            </w:r>
+            <w:proofErr w:type="spellStart"/>
+            <w:r>
+              <w:t>retail</w:t>
+            </w:r>
+            <w:proofErr w:type="spellEnd"/>
+            <w:r>
+              <w:t xml:space="preserve"> e delle piattaforme di servizi digitali in abbonamento o on-demand.</w:t>
+            </w:r>
+          </w:p>
+          <w:p>
+            <w:pPr>
+              <w:pStyle w:val="NormaleWeb"/>
+              <w:numPr>
+                <w:ilvl w:val="0"/>
+                <w:numId w:val="5"/>
+              </w:numPr>
+            </w:pPr>
+            <w:r>
+              <w:rPr>
+                <w:b/>
+                <w:bCs/>
+              </w:rPr>
+              <w:t>Vantaggi operativi:</w:t>
+            </w:r>
+          </w:p>
+          <w:p>
+            <w:pPr>
+              <w:pStyle w:val="NormaleWeb"/>
+              <w:numPr>
+                <w:ilvl w:val="1"/>
+                <w:numId w:val="5"/>
+              </w:numPr>
+            </w:pPr>
+            <w:r>
+              <w:t>Automazione delle decisioni di marketing strategico.</w:t>
+            </w:r>
+          </w:p>
+          <w:p>
+            <w:pPr>
+              <w:pStyle w:val="NormaleWeb"/>
+              <w:numPr>
+                <w:ilvl w:val="1"/>
+                <w:numId w:val="5"/>
+              </w:numPr>
+            </w:pPr>
+            <w:r>
+              <w:t>Ottimizzazione del budget pubblicitario concentrandolo sui segmenti ad alto valore (</w:t>
+            </w:r>
+            <w:r>
+              <w:rPr>
+                <w:i/>
+                <w:iCs/>
+              </w:rPr>
+              <w:t>Campioni</w:t>
+            </w:r>
+            <w:r>
+              <w:t xml:space="preserve"> e </w:t>
+            </w:r>
+            <w:r>
+              <w:rPr>
+                <w:i/>
+                <w:iCs/>
+              </w:rPr>
+              <w:t>Fedeli</w:t>
+            </w:r>
+            <w:r>
+              <w:t>).</w:t>
+            </w:r>
+          </w:p>
+          <w:p>
+            <w:pPr>
+              <w:pStyle w:val="NormaleWeb"/>
+              <w:numPr>
+                <w:ilvl w:val="1"/>
+                <w:numId w:val="5"/>
+              </w:numPr>
+            </w:pPr>
+            <w:r>
+              <w:t>Riduzione del tasso di abbandono (</w:t>
+            </w:r>
+            <w:proofErr w:type="spellStart"/>
+            <w:r>
+              <w:rPr>
+                <w:i/>
+                <w:iCs/>
+              </w:rPr>
+              <w:t>churn</w:t>
+            </w:r>
+            <w:proofErr w:type="spellEnd"/>
+            <w:r>
+              <w:rPr>
+                <w:i/>
+                <w:iCs/>
+              </w:rPr>
+              <w:t xml:space="preserve"> rate</w:t>
+            </w:r>
+            <w:r>
+              <w:t xml:space="preserve">) grazie a interventi tempestivi sui clienti identificati come </w:t>
+            </w:r>
+            <w:r>
+              <w:rPr>
+                <w:i/>
+                <w:iCs/>
+              </w:rPr>
+              <w:t>A Rischio</w:t>
+            </w:r>
+            <w:r>
+              <w:t>.</w:t>
+            </w:r>
+          </w:p>
+          <w:p>
+            <w:pPr>
               <w:jc w:val="both"/>
               <w:rPr>
                 <w:rFonts w:ascii="Times New Roman" w:hAnsi="Times New Roman" w:cs="Times New Roman"/>
@@ -2137,27 +4066,6 @@
                 <w:lang w:val="it-IT"/>
               </w:rPr>
             </w:pPr>
-          </w:p>
-          <w:p>
-            <w:pPr>
-              <w:jc w:val="both"/>
-              <w:rPr>
-                <w:rFonts w:ascii="Times New Roman" w:hAnsi="Times New Roman" w:cs="Times New Roman"/>
-                <w:sz w:val="28"/>
-                <w:szCs w:val="28"/>
-                <w:lang w:val="it-IT"/>
-              </w:rPr>
-            </w:pPr>
-            <w:r>
-              <w:rPr>
-                <w:rFonts w:ascii="Times New Roman" w:hAnsi="Times New Roman" w:cs="Times New Roman"/>
-                <w:color w:val="FF0000"/>
-                <w:sz w:val="24"/>
-                <w:szCs w:val="24"/>
-                <w:lang w:val="it-IT"/>
-              </w:rPr>
-              <w:t>Inserisci qui il testo</w:t>
-            </w:r>
           </w:p>
         </w:tc>
       </w:tr>
@@ -2204,7 +4112,7 @@
                           <pic:cNvPicPr/>
                         </pic:nvPicPr>
                         <pic:blipFill>
-                          <a:blip r:embed="rId28">
+                          <a:blip r:embed="rId29">
                             <a:extLst>
                               <a:ext uri="{28A0092B-C50C-407E-A947-70E740481C1C}">
                                 <a14:useLocalDpi xmlns:a14="http://schemas.microsoft.com/office/drawing/2010/main" val="0"/>
@@ -2241,6 +4149,217 @@
           </w:tcPr>
           <w:p>
             <w:pPr>
+              <w:spacing w:before="100" w:beforeAutospacing="1" w:after="100" w:afterAutospacing="1" w:line="240" w:lineRule="auto"/>
+              <w:rPr>
+                <w:rFonts w:ascii="Times New Roman" w:eastAsia="Times New Roman" w:hAnsi="Times New Roman" w:cs="Times New Roman"/>
+                <w:sz w:val="24"/>
+                <w:szCs w:val="24"/>
+                <w:lang w:val="it-IT"/>
+              </w:rPr>
+            </w:pPr>
+            <w:r>
+              <w:rPr>
+                <w:rFonts w:ascii="Times New Roman" w:eastAsia="Times New Roman" w:hAnsi="Symbol" w:cs="Times New Roman"/>
+                <w:sz w:val="24"/>
+                <w:szCs w:val="24"/>
+                <w:lang w:val="it-IT"/>
+              </w:rPr>
+              <w:t></w:t>
+            </w:r>
+            <w:r>
+              <w:rPr>
+                <w:rFonts w:ascii="Times New Roman" w:eastAsia="Times New Roman" w:hAnsi="Times New Roman" w:cs="Times New Roman"/>
+                <w:sz w:val="24"/>
+                <w:szCs w:val="24"/>
+                <w:lang w:val="it-IT"/>
+              </w:rPr>
+              <w:t xml:space="preserve">  </w:t>
+            </w:r>
+            <w:r>
+              <w:rPr>
+                <w:rFonts w:ascii="Times New Roman" w:eastAsia="Times New Roman" w:hAnsi="Times New Roman" w:cs="Times New Roman"/>
+                <w:b/>
+                <w:bCs/>
+                <w:sz w:val="24"/>
+                <w:szCs w:val="24"/>
+                <w:lang w:val="it-IT"/>
+              </w:rPr>
+              <w:t>Potenzialità:</w:t>
+            </w:r>
+            <w:r>
+              <w:rPr>
+                <w:rFonts w:ascii="Times New Roman" w:eastAsia="Times New Roman" w:hAnsi="Times New Roman" w:cs="Times New Roman"/>
+                <w:sz w:val="24"/>
+                <w:szCs w:val="24"/>
+                <w:lang w:val="it-IT"/>
+              </w:rPr>
+              <w:t xml:space="preserve"> Il prototipo garantisce un'elevata interpretabilità di business grazie all'uso delle etichette descrittive e alla proiezione bidimensionale PCA. L'automazione tramite script di orchestrazione assicura la totale riproducibilità dei risultati. La validazione effettuata mediante l'</w:t>
+            </w:r>
+            <w:proofErr w:type="spellStart"/>
+            <w:r>
+              <w:rPr>
+                <w:rFonts w:ascii="Times New Roman" w:eastAsia="Times New Roman" w:hAnsi="Times New Roman" w:cs="Times New Roman"/>
+                <w:sz w:val="24"/>
+                <w:szCs w:val="24"/>
+                <w:lang w:val="it-IT"/>
+              </w:rPr>
+              <w:t>Adjusted</w:t>
+            </w:r>
+            <w:proofErr w:type="spellEnd"/>
+            <w:r>
+              <w:rPr>
+                <w:rFonts w:ascii="Times New Roman" w:eastAsia="Times New Roman" w:hAnsi="Times New Roman" w:cs="Times New Roman"/>
+                <w:sz w:val="24"/>
+                <w:szCs w:val="24"/>
+                <w:lang w:val="it-IT"/>
+              </w:rPr>
+              <w:t xml:space="preserve"> Rand Index (ARI) rispetto ai profili di origine ha confermato un'ottima aderenza del </w:t>
+            </w:r>
+            <w:proofErr w:type="spellStart"/>
+            <w:r>
+              <w:rPr>
+                <w:rFonts w:ascii="Times New Roman" w:eastAsia="Times New Roman" w:hAnsi="Times New Roman" w:cs="Times New Roman"/>
+                <w:sz w:val="24"/>
+                <w:szCs w:val="24"/>
+                <w:lang w:val="it-IT"/>
+              </w:rPr>
+              <w:t>clustering</w:t>
+            </w:r>
+            <w:proofErr w:type="spellEnd"/>
+            <w:r>
+              <w:rPr>
+                <w:rFonts w:ascii="Times New Roman" w:eastAsia="Times New Roman" w:hAnsi="Times New Roman" w:cs="Times New Roman"/>
+                <w:sz w:val="24"/>
+                <w:szCs w:val="24"/>
+                <w:lang w:val="it-IT"/>
+              </w:rPr>
+              <w:t xml:space="preserve"> alla struttura reale dei dati.</w:t>
+            </w:r>
+          </w:p>
+          <w:p>
+            <w:pPr>
+              <w:spacing w:before="100" w:beforeAutospacing="1" w:after="100" w:afterAutospacing="1" w:line="240" w:lineRule="auto"/>
+              <w:rPr>
+                <w:rFonts w:ascii="Times New Roman" w:eastAsia="Times New Roman" w:hAnsi="Times New Roman" w:cs="Times New Roman"/>
+                <w:sz w:val="24"/>
+                <w:szCs w:val="24"/>
+                <w:lang w:val="it-IT"/>
+              </w:rPr>
+            </w:pPr>
+            <w:r>
+              <w:rPr>
+                <w:rFonts w:ascii="Times New Roman" w:eastAsia="Times New Roman" w:hAnsi="Symbol" w:cs="Times New Roman"/>
+                <w:sz w:val="24"/>
+                <w:szCs w:val="24"/>
+                <w:lang w:val="it-IT"/>
+              </w:rPr>
+              <w:t></w:t>
+            </w:r>
+            <w:r>
+              <w:rPr>
+                <w:rFonts w:ascii="Times New Roman" w:eastAsia="Times New Roman" w:hAnsi="Times New Roman" w:cs="Times New Roman"/>
+                <w:sz w:val="24"/>
+                <w:szCs w:val="24"/>
+                <w:lang w:val="it-IT"/>
+              </w:rPr>
+              <w:t xml:space="preserve">  </w:t>
+            </w:r>
+            <w:r>
+              <w:rPr>
+                <w:rFonts w:ascii="Times New Roman" w:eastAsia="Times New Roman" w:hAnsi="Times New Roman" w:cs="Times New Roman"/>
+                <w:b/>
+                <w:bCs/>
+                <w:sz w:val="24"/>
+                <w:szCs w:val="24"/>
+                <w:lang w:val="it-IT"/>
+              </w:rPr>
+              <w:t>Limiti metodologici:</w:t>
+            </w:r>
+            <w:r>
+              <w:rPr>
+                <w:rFonts w:ascii="Times New Roman" w:eastAsia="Times New Roman" w:hAnsi="Times New Roman" w:cs="Times New Roman"/>
+                <w:sz w:val="24"/>
+                <w:szCs w:val="24"/>
+                <w:lang w:val="it-IT"/>
+              </w:rPr>
+              <w:t xml:space="preserve"> Poiché i dati di partenza sono sintetici, i cluster vengono individuati "per costruzione"; su dati reali </w:t>
+            </w:r>
+            <w:proofErr w:type="spellStart"/>
+            <w:r>
+              <w:rPr>
+                <w:rFonts w:ascii="Times New Roman" w:eastAsia="Times New Roman" w:hAnsi="Times New Roman" w:cs="Times New Roman"/>
+                <w:sz w:val="24"/>
+                <w:szCs w:val="24"/>
+                <w:lang w:val="it-IT"/>
+              </w:rPr>
+              <w:t>reali</w:t>
+            </w:r>
+            <w:proofErr w:type="spellEnd"/>
+            <w:r>
+              <w:rPr>
+                <w:rFonts w:ascii="Times New Roman" w:eastAsia="Times New Roman" w:hAnsi="Times New Roman" w:cs="Times New Roman"/>
+                <w:sz w:val="24"/>
+                <w:szCs w:val="24"/>
+                <w:lang w:val="it-IT"/>
+              </w:rPr>
+              <w:t>, la separazione geometrica potrebbe risultare meno netta. Inoltre, il K-</w:t>
+            </w:r>
+            <w:proofErr w:type="spellStart"/>
+            <w:r>
+              <w:rPr>
+                <w:rFonts w:ascii="Times New Roman" w:eastAsia="Times New Roman" w:hAnsi="Times New Roman" w:cs="Times New Roman"/>
+                <w:sz w:val="24"/>
+                <w:szCs w:val="24"/>
+                <w:lang w:val="it-IT"/>
+              </w:rPr>
+              <w:t>Means</w:t>
+            </w:r>
+            <w:proofErr w:type="spellEnd"/>
+            <w:r>
+              <w:rPr>
+                <w:rFonts w:ascii="Times New Roman" w:eastAsia="Times New Roman" w:hAnsi="Times New Roman" w:cs="Times New Roman"/>
+                <w:sz w:val="24"/>
+                <w:szCs w:val="24"/>
+                <w:lang w:val="it-IT"/>
+              </w:rPr>
+              <w:t xml:space="preserve"> assume cluster di forma sferica ed è sensibile alla presenza di distribuzioni asimmetriche. Si evidenzia infine la necessità di un aggiornamento periodico dei modelli per prevenire fenomeni di decadimento predittivo (</w:t>
+            </w:r>
+            <w:r>
+              <w:rPr>
+                <w:rFonts w:ascii="Times New Roman" w:eastAsia="Times New Roman" w:hAnsi="Times New Roman" w:cs="Times New Roman"/>
+                <w:i/>
+                <w:iCs/>
+                <w:sz w:val="24"/>
+                <w:szCs w:val="24"/>
+                <w:lang w:val="it-IT"/>
+              </w:rPr>
+              <w:t xml:space="preserve">data </w:t>
+            </w:r>
+            <w:proofErr w:type="spellStart"/>
+            <w:r>
+              <w:rPr>
+                <w:rFonts w:ascii="Times New Roman" w:eastAsia="Times New Roman" w:hAnsi="Times New Roman" w:cs="Times New Roman"/>
+                <w:i/>
+                <w:iCs/>
+                <w:sz w:val="24"/>
+                <w:szCs w:val="24"/>
+                <w:lang w:val="it-IT"/>
+              </w:rPr>
+              <w:t>drift</w:t>
+            </w:r>
+            <w:proofErr w:type="spellEnd"/>
+            <w:r>
+              <w:rPr>
+                <w:rFonts w:ascii="Times New Roman" w:eastAsia="Times New Roman" w:hAnsi="Times New Roman" w:cs="Times New Roman"/>
+                <w:sz w:val="24"/>
+                <w:szCs w:val="24"/>
+                <w:lang w:val="it-IT"/>
+              </w:rPr>
+              <w:t>).</w:t>
+            </w:r>
+          </w:p>
+          <w:p>
+            <w:pPr>
               <w:rPr>
                 <w:rFonts w:ascii="Times New Roman" w:hAnsi="Times New Roman" w:cs="Times New Roman"/>
                 <w:b/>
@@ -2250,28 +4369,6 @@
                 <w:lang w:val="it-IT"/>
               </w:rPr>
             </w:pPr>
-          </w:p>
-          <w:p>
-            <w:pPr>
-              <w:rPr>
-                <w:rFonts w:ascii="Times New Roman" w:hAnsi="Times New Roman" w:cs="Times New Roman"/>
-                <w:b/>
-                <w:color w:val="000000"/>
-                <w:sz w:val="28"/>
-                <w:szCs w:val="28"/>
-                <w:lang w:val="it-IT"/>
-              </w:rPr>
-            </w:pPr>
-            <w:r>
-              <w:rPr>
-                <w:rFonts w:ascii="Times New Roman" w:hAnsi="Times New Roman" w:cs="Times New Roman"/>
-                <w:color w:val="FF0000"/>
-                <w:sz w:val="24"/>
-                <w:szCs w:val="24"/>
-                <w:lang w:val="it-IT"/>
-              </w:rPr>
-              <w:t>Inserisci qui il testo</w:t>
-            </w:r>
           </w:p>
         </w:tc>
       </w:tr>
@@ -2370,8 +4467,737 @@
 </w:document>
 </file>
 
+<file path=word/numbering.xml><?xml version="1.0" encoding="utf-8"?>
+<w:numbering xmlns:wpc="http://schemas.microsoft.com/office/word/2010/wordprocessingCanvas" xmlns:mc="http://schemas.openxmlformats.org/markup-compatibility/2006" xmlns:o="urn:schemas-microsoft-com:office:office" xmlns:r="http://schemas.openxmlformats.org/officeDocument/2006/relationships" xmlns:m="http://schemas.openxmlformats.org/officeDocument/2006/math" xmlns:v="urn:schemas-microsoft-com:vml" xmlns:wp14="http://schemas.microsoft.com/office/word/2010/wordprocessingDrawing" xmlns:wp="http://schemas.openxmlformats.org/drawingml/2006/wordprocessingDrawing" xmlns:w10="urn:schemas-microsoft-com:office:word" xmlns:w="http://schemas.openxmlformats.org/wordprocessingml/2006/main" xmlns:w14="http://schemas.microsoft.com/office/word/2010/wordml" xmlns:w15="http://schemas.microsoft.com/office/word/2012/wordml" xmlns:wpg="http://schemas.microsoft.com/office/word/2010/wordprocessingGroup" xmlns:wpi="http://schemas.microsoft.com/office/word/2010/wordprocessingInk" xmlns:wne="http://schemas.microsoft.com/office/word/2006/wordml" xmlns:wps="http://schemas.microsoft.com/office/word/2010/wordprocessingShape" mc:Ignorable="w14 w15 wp14">
+  <w:abstractNum w:abstractNumId="0" w15:restartNumberingAfterBreak="0">
+    <w:nsid w:val="2AF070A0"/>
+    <w:multiLevelType w:val="multilevel"/>
+    <w:tmpl w:val="0D06FAE4"/>
+    <w:lvl w:ilvl="0">
+      <w:start w:val="1"/>
+      <w:numFmt w:val="bullet"/>
+      <w:lvlText w:val=""/>
+      <w:lvlJc w:val="left"/>
+      <w:pPr>
+        <w:tabs>
+          <w:tab w:val="num" w:pos="720"/>
+        </w:tabs>
+        <w:ind w:left="720" w:hanging="360"/>
+      </w:pPr>
+      <w:rPr>
+        <w:rFonts w:ascii="Symbol" w:hAnsi="Symbol" w:hint="default"/>
+        <w:sz w:val="20"/>
+      </w:rPr>
+    </w:lvl>
+    <w:lvl w:ilvl="1" w:tentative="1">
+      <w:start w:val="1"/>
+      <w:numFmt w:val="bullet"/>
+      <w:lvlText w:val="o"/>
+      <w:lvlJc w:val="left"/>
+      <w:pPr>
+        <w:tabs>
+          <w:tab w:val="num" w:pos="1440"/>
+        </w:tabs>
+        <w:ind w:left="1440" w:hanging="360"/>
+      </w:pPr>
+      <w:rPr>
+        <w:rFonts w:ascii="Courier New" w:hAnsi="Courier New" w:hint="default"/>
+        <w:sz w:val="20"/>
+      </w:rPr>
+    </w:lvl>
+    <w:lvl w:ilvl="2" w:tentative="1">
+      <w:start w:val="1"/>
+      <w:numFmt w:val="bullet"/>
+      <w:lvlText w:val=""/>
+      <w:lvlJc w:val="left"/>
+      <w:pPr>
+        <w:tabs>
+          <w:tab w:val="num" w:pos="2160"/>
+        </w:tabs>
+        <w:ind w:left="2160" w:hanging="360"/>
+      </w:pPr>
+      <w:rPr>
+        <w:rFonts w:ascii="Wingdings" w:hAnsi="Wingdings" w:hint="default"/>
+        <w:sz w:val="20"/>
+      </w:rPr>
+    </w:lvl>
+    <w:lvl w:ilvl="3" w:tentative="1">
+      <w:start w:val="1"/>
+      <w:numFmt w:val="bullet"/>
+      <w:lvlText w:val=""/>
+      <w:lvlJc w:val="left"/>
+      <w:pPr>
+        <w:tabs>
+          <w:tab w:val="num" w:pos="2880"/>
+        </w:tabs>
+        <w:ind w:left="2880" w:hanging="360"/>
+      </w:pPr>
+      <w:rPr>
+        <w:rFonts w:ascii="Wingdings" w:hAnsi="Wingdings" w:hint="default"/>
+        <w:sz w:val="20"/>
+      </w:rPr>
+    </w:lvl>
+    <w:lvl w:ilvl="4" w:tentative="1">
+      <w:start w:val="1"/>
+      <w:numFmt w:val="bullet"/>
+      <w:lvlText w:val=""/>
+      <w:lvlJc w:val="left"/>
+      <w:pPr>
+        <w:tabs>
+          <w:tab w:val="num" w:pos="3600"/>
+        </w:tabs>
+        <w:ind w:left="3600" w:hanging="360"/>
+      </w:pPr>
+      <w:rPr>
+        <w:rFonts w:ascii="Wingdings" w:hAnsi="Wingdings" w:hint="default"/>
+        <w:sz w:val="20"/>
+      </w:rPr>
+    </w:lvl>
+    <w:lvl w:ilvl="5" w:tentative="1">
+      <w:start w:val="1"/>
+      <w:numFmt w:val="bullet"/>
+      <w:lvlText w:val=""/>
+      <w:lvlJc w:val="left"/>
+      <w:pPr>
+        <w:tabs>
+          <w:tab w:val="num" w:pos="4320"/>
+        </w:tabs>
+        <w:ind w:left="4320" w:hanging="360"/>
+      </w:pPr>
+      <w:rPr>
+        <w:rFonts w:ascii="Wingdings" w:hAnsi="Wingdings" w:hint="default"/>
+        <w:sz w:val="20"/>
+      </w:rPr>
+    </w:lvl>
+    <w:lvl w:ilvl="6" w:tentative="1">
+      <w:start w:val="1"/>
+      <w:numFmt w:val="bullet"/>
+      <w:lvlText w:val=""/>
+      <w:lvlJc w:val="left"/>
+      <w:pPr>
+        <w:tabs>
+          <w:tab w:val="num" w:pos="5040"/>
+        </w:tabs>
+        <w:ind w:left="5040" w:hanging="360"/>
+      </w:pPr>
+      <w:rPr>
+        <w:rFonts w:ascii="Wingdings" w:hAnsi="Wingdings" w:hint="default"/>
+        <w:sz w:val="20"/>
+      </w:rPr>
+    </w:lvl>
+    <w:lvl w:ilvl="7" w:tentative="1">
+      <w:start w:val="1"/>
+      <w:numFmt w:val="bullet"/>
+      <w:lvlText w:val=""/>
+      <w:lvlJc w:val="left"/>
+      <w:pPr>
+        <w:tabs>
+          <w:tab w:val="num" w:pos="5760"/>
+        </w:tabs>
+        <w:ind w:left="5760" w:hanging="360"/>
+      </w:pPr>
+      <w:rPr>
+        <w:rFonts w:ascii="Wingdings" w:hAnsi="Wingdings" w:hint="default"/>
+        <w:sz w:val="20"/>
+      </w:rPr>
+    </w:lvl>
+    <w:lvl w:ilvl="8" w:tentative="1">
+      <w:start w:val="1"/>
+      <w:numFmt w:val="bullet"/>
+      <w:lvlText w:val=""/>
+      <w:lvlJc w:val="left"/>
+      <w:pPr>
+        <w:tabs>
+          <w:tab w:val="num" w:pos="6480"/>
+        </w:tabs>
+        <w:ind w:left="6480" w:hanging="360"/>
+      </w:pPr>
+      <w:rPr>
+        <w:rFonts w:ascii="Wingdings" w:hAnsi="Wingdings" w:hint="default"/>
+        <w:sz w:val="20"/>
+      </w:rPr>
+    </w:lvl>
+  </w:abstractNum>
+  <w:abstractNum w:abstractNumId="1" w15:restartNumberingAfterBreak="0">
+    <w:nsid w:val="2BB875BA"/>
+    <w:multiLevelType w:val="multilevel"/>
+    <w:tmpl w:val="5D4E0E66"/>
+    <w:lvl w:ilvl="0">
+      <w:start w:val="1"/>
+      <w:numFmt w:val="bullet"/>
+      <w:lvlText w:val=""/>
+      <w:lvlJc w:val="left"/>
+      <w:pPr>
+        <w:tabs>
+          <w:tab w:val="num" w:pos="720"/>
+        </w:tabs>
+        <w:ind w:left="720" w:hanging="360"/>
+      </w:pPr>
+      <w:rPr>
+        <w:rFonts w:ascii="Symbol" w:hAnsi="Symbol" w:hint="default"/>
+        <w:sz w:val="20"/>
+      </w:rPr>
+    </w:lvl>
+    <w:lvl w:ilvl="1" w:tentative="1">
+      <w:start w:val="1"/>
+      <w:numFmt w:val="bullet"/>
+      <w:lvlText w:val="o"/>
+      <w:lvlJc w:val="left"/>
+      <w:pPr>
+        <w:tabs>
+          <w:tab w:val="num" w:pos="1440"/>
+        </w:tabs>
+        <w:ind w:left="1440" w:hanging="360"/>
+      </w:pPr>
+      <w:rPr>
+        <w:rFonts w:ascii="Courier New" w:hAnsi="Courier New" w:hint="default"/>
+        <w:sz w:val="20"/>
+      </w:rPr>
+    </w:lvl>
+    <w:lvl w:ilvl="2" w:tentative="1">
+      <w:start w:val="1"/>
+      <w:numFmt w:val="bullet"/>
+      <w:lvlText w:val=""/>
+      <w:lvlJc w:val="left"/>
+      <w:pPr>
+        <w:tabs>
+          <w:tab w:val="num" w:pos="2160"/>
+        </w:tabs>
+        <w:ind w:left="2160" w:hanging="360"/>
+      </w:pPr>
+      <w:rPr>
+        <w:rFonts w:ascii="Wingdings" w:hAnsi="Wingdings" w:hint="default"/>
+        <w:sz w:val="20"/>
+      </w:rPr>
+    </w:lvl>
+    <w:lvl w:ilvl="3" w:tentative="1">
+      <w:start w:val="1"/>
+      <w:numFmt w:val="bullet"/>
+      <w:lvlText w:val=""/>
+      <w:lvlJc w:val="left"/>
+      <w:pPr>
+        <w:tabs>
+          <w:tab w:val="num" w:pos="2880"/>
+        </w:tabs>
+        <w:ind w:left="2880" w:hanging="360"/>
+      </w:pPr>
+      <w:rPr>
+        <w:rFonts w:ascii="Wingdings" w:hAnsi="Wingdings" w:hint="default"/>
+        <w:sz w:val="20"/>
+      </w:rPr>
+    </w:lvl>
+    <w:lvl w:ilvl="4" w:tentative="1">
+      <w:start w:val="1"/>
+      <w:numFmt w:val="bullet"/>
+      <w:lvlText w:val=""/>
+      <w:lvlJc w:val="left"/>
+      <w:pPr>
+        <w:tabs>
+          <w:tab w:val="num" w:pos="3600"/>
+        </w:tabs>
+        <w:ind w:left="3600" w:hanging="360"/>
+      </w:pPr>
+      <w:rPr>
+        <w:rFonts w:ascii="Wingdings" w:hAnsi="Wingdings" w:hint="default"/>
+        <w:sz w:val="20"/>
+      </w:rPr>
+    </w:lvl>
+    <w:lvl w:ilvl="5" w:tentative="1">
+      <w:start w:val="1"/>
+      <w:numFmt w:val="bullet"/>
+      <w:lvlText w:val=""/>
+      <w:lvlJc w:val="left"/>
+      <w:pPr>
+        <w:tabs>
+          <w:tab w:val="num" w:pos="4320"/>
+        </w:tabs>
+        <w:ind w:left="4320" w:hanging="360"/>
+      </w:pPr>
+      <w:rPr>
+        <w:rFonts w:ascii="Wingdings" w:hAnsi="Wingdings" w:hint="default"/>
+        <w:sz w:val="20"/>
+      </w:rPr>
+    </w:lvl>
+    <w:lvl w:ilvl="6" w:tentative="1">
+      <w:start w:val="1"/>
+      <w:numFmt w:val="bullet"/>
+      <w:lvlText w:val=""/>
+      <w:lvlJc w:val="left"/>
+      <w:pPr>
+        <w:tabs>
+          <w:tab w:val="num" w:pos="5040"/>
+        </w:tabs>
+        <w:ind w:left="5040" w:hanging="360"/>
+      </w:pPr>
+      <w:rPr>
+        <w:rFonts w:ascii="Wingdings" w:hAnsi="Wingdings" w:hint="default"/>
+        <w:sz w:val="20"/>
+      </w:rPr>
+    </w:lvl>
+    <w:lvl w:ilvl="7" w:tentative="1">
+      <w:start w:val="1"/>
+      <w:numFmt w:val="bullet"/>
+      <w:lvlText w:val=""/>
+      <w:lvlJc w:val="left"/>
+      <w:pPr>
+        <w:tabs>
+          <w:tab w:val="num" w:pos="5760"/>
+        </w:tabs>
+        <w:ind w:left="5760" w:hanging="360"/>
+      </w:pPr>
+      <w:rPr>
+        <w:rFonts w:ascii="Wingdings" w:hAnsi="Wingdings" w:hint="default"/>
+        <w:sz w:val="20"/>
+      </w:rPr>
+    </w:lvl>
+    <w:lvl w:ilvl="8" w:tentative="1">
+      <w:start w:val="1"/>
+      <w:numFmt w:val="bullet"/>
+      <w:lvlText w:val=""/>
+      <w:lvlJc w:val="left"/>
+      <w:pPr>
+        <w:tabs>
+          <w:tab w:val="num" w:pos="6480"/>
+        </w:tabs>
+        <w:ind w:left="6480" w:hanging="360"/>
+      </w:pPr>
+      <w:rPr>
+        <w:rFonts w:ascii="Wingdings" w:hAnsi="Wingdings" w:hint="default"/>
+        <w:sz w:val="20"/>
+      </w:rPr>
+    </w:lvl>
+  </w:abstractNum>
+  <w:abstractNum w:abstractNumId="2" w15:restartNumberingAfterBreak="0">
+    <w:nsid w:val="5BA45C01"/>
+    <w:multiLevelType w:val="multilevel"/>
+    <w:tmpl w:val="9230A3A0"/>
+    <w:lvl w:ilvl="0">
+      <w:start w:val="1"/>
+      <w:numFmt w:val="decimal"/>
+      <w:lvlText w:val="%1."/>
+      <w:lvlJc w:val="left"/>
+      <w:pPr>
+        <w:tabs>
+          <w:tab w:val="num" w:pos="720"/>
+        </w:tabs>
+        <w:ind w:left="720" w:hanging="360"/>
+      </w:pPr>
+    </w:lvl>
+    <w:lvl w:ilvl="1" w:tentative="1">
+      <w:start w:val="1"/>
+      <w:numFmt w:val="decimal"/>
+      <w:lvlText w:val="%2."/>
+      <w:lvlJc w:val="left"/>
+      <w:pPr>
+        <w:tabs>
+          <w:tab w:val="num" w:pos="1440"/>
+        </w:tabs>
+        <w:ind w:left="1440" w:hanging="360"/>
+      </w:pPr>
+    </w:lvl>
+    <w:lvl w:ilvl="2" w:tentative="1">
+      <w:start w:val="1"/>
+      <w:numFmt w:val="decimal"/>
+      <w:lvlText w:val="%3."/>
+      <w:lvlJc w:val="left"/>
+      <w:pPr>
+        <w:tabs>
+          <w:tab w:val="num" w:pos="2160"/>
+        </w:tabs>
+        <w:ind w:left="2160" w:hanging="360"/>
+      </w:pPr>
+    </w:lvl>
+    <w:lvl w:ilvl="3" w:tentative="1">
+      <w:start w:val="1"/>
+      <w:numFmt w:val="decimal"/>
+      <w:lvlText w:val="%4."/>
+      <w:lvlJc w:val="left"/>
+      <w:pPr>
+        <w:tabs>
+          <w:tab w:val="num" w:pos="2880"/>
+        </w:tabs>
+        <w:ind w:left="2880" w:hanging="360"/>
+      </w:pPr>
+    </w:lvl>
+    <w:lvl w:ilvl="4" w:tentative="1">
+      <w:start w:val="1"/>
+      <w:numFmt w:val="decimal"/>
+      <w:lvlText w:val="%5."/>
+      <w:lvlJc w:val="left"/>
+      <w:pPr>
+        <w:tabs>
+          <w:tab w:val="num" w:pos="3600"/>
+        </w:tabs>
+        <w:ind w:left="3600" w:hanging="360"/>
+      </w:pPr>
+    </w:lvl>
+    <w:lvl w:ilvl="5" w:tentative="1">
+      <w:start w:val="1"/>
+      <w:numFmt w:val="decimal"/>
+      <w:lvlText w:val="%6."/>
+      <w:lvlJc w:val="left"/>
+      <w:pPr>
+        <w:tabs>
+          <w:tab w:val="num" w:pos="4320"/>
+        </w:tabs>
+        <w:ind w:left="4320" w:hanging="360"/>
+      </w:pPr>
+    </w:lvl>
+    <w:lvl w:ilvl="6" w:tentative="1">
+      <w:start w:val="1"/>
+      <w:numFmt w:val="decimal"/>
+      <w:lvlText w:val="%7."/>
+      <w:lvlJc w:val="left"/>
+      <w:pPr>
+        <w:tabs>
+          <w:tab w:val="num" w:pos="5040"/>
+        </w:tabs>
+        <w:ind w:left="5040" w:hanging="360"/>
+      </w:pPr>
+    </w:lvl>
+    <w:lvl w:ilvl="7" w:tentative="1">
+      <w:start w:val="1"/>
+      <w:numFmt w:val="decimal"/>
+      <w:lvlText w:val="%8."/>
+      <w:lvlJc w:val="left"/>
+      <w:pPr>
+        <w:tabs>
+          <w:tab w:val="num" w:pos="5760"/>
+        </w:tabs>
+        <w:ind w:left="5760" w:hanging="360"/>
+      </w:pPr>
+    </w:lvl>
+    <w:lvl w:ilvl="8" w:tentative="1">
+      <w:start w:val="1"/>
+      <w:numFmt w:val="decimal"/>
+      <w:lvlText w:val="%9."/>
+      <w:lvlJc w:val="left"/>
+      <w:pPr>
+        <w:tabs>
+          <w:tab w:val="num" w:pos="6480"/>
+        </w:tabs>
+        <w:ind w:left="6480" w:hanging="360"/>
+      </w:pPr>
+    </w:lvl>
+  </w:abstractNum>
+  <w:abstractNum w:abstractNumId="3" w15:restartNumberingAfterBreak="0">
+    <w:nsid w:val="64F555D0"/>
+    <w:multiLevelType w:val="multilevel"/>
+    <w:tmpl w:val="CD442D32"/>
+    <w:lvl w:ilvl="0">
+      <w:start w:val="1"/>
+      <w:numFmt w:val="bullet"/>
+      <w:lvlText w:val=""/>
+      <w:lvlJc w:val="left"/>
+      <w:pPr>
+        <w:tabs>
+          <w:tab w:val="num" w:pos="720"/>
+        </w:tabs>
+        <w:ind w:left="720" w:hanging="360"/>
+      </w:pPr>
+      <w:rPr>
+        <w:rFonts w:ascii="Symbol" w:hAnsi="Symbol" w:hint="default"/>
+        <w:sz w:val="20"/>
+      </w:rPr>
+    </w:lvl>
+    <w:lvl w:ilvl="1">
+      <w:start w:val="1"/>
+      <w:numFmt w:val="bullet"/>
+      <w:lvlText w:val="o"/>
+      <w:lvlJc w:val="left"/>
+      <w:pPr>
+        <w:tabs>
+          <w:tab w:val="num" w:pos="1440"/>
+        </w:tabs>
+        <w:ind w:left="1440" w:hanging="360"/>
+      </w:pPr>
+      <w:rPr>
+        <w:rFonts w:ascii="Courier New" w:hAnsi="Courier New" w:hint="default"/>
+        <w:sz w:val="20"/>
+      </w:rPr>
+    </w:lvl>
+    <w:lvl w:ilvl="2" w:tentative="1">
+      <w:start w:val="1"/>
+      <w:numFmt w:val="bullet"/>
+      <w:lvlText w:val=""/>
+      <w:lvlJc w:val="left"/>
+      <w:pPr>
+        <w:tabs>
+          <w:tab w:val="num" w:pos="2160"/>
+        </w:tabs>
+        <w:ind w:left="2160" w:hanging="360"/>
+      </w:pPr>
+      <w:rPr>
+        <w:rFonts w:ascii="Wingdings" w:hAnsi="Wingdings" w:hint="default"/>
+        <w:sz w:val="20"/>
+      </w:rPr>
+    </w:lvl>
+    <w:lvl w:ilvl="3" w:tentative="1">
+      <w:start w:val="1"/>
+      <w:numFmt w:val="bullet"/>
+      <w:lvlText w:val=""/>
+      <w:lvlJc w:val="left"/>
+      <w:pPr>
+        <w:tabs>
+          <w:tab w:val="num" w:pos="2880"/>
+        </w:tabs>
+        <w:ind w:left="2880" w:hanging="360"/>
+      </w:pPr>
+      <w:rPr>
+        <w:rFonts w:ascii="Wingdings" w:hAnsi="Wingdings" w:hint="default"/>
+        <w:sz w:val="20"/>
+      </w:rPr>
+    </w:lvl>
+    <w:lvl w:ilvl="4" w:tentative="1">
+      <w:start w:val="1"/>
+      <w:numFmt w:val="bullet"/>
+      <w:lvlText w:val=""/>
+      <w:lvlJc w:val="left"/>
+      <w:pPr>
+        <w:tabs>
+          <w:tab w:val="num" w:pos="3600"/>
+        </w:tabs>
+        <w:ind w:left="3600" w:hanging="360"/>
+      </w:pPr>
+      <w:rPr>
+        <w:rFonts w:ascii="Wingdings" w:hAnsi="Wingdings" w:hint="default"/>
+        <w:sz w:val="20"/>
+      </w:rPr>
+    </w:lvl>
+    <w:lvl w:ilvl="5" w:tentative="1">
+      <w:start w:val="1"/>
+      <w:numFmt w:val="bullet"/>
+      <w:lvlText w:val=""/>
+      <w:lvlJc w:val="left"/>
+      <w:pPr>
+        <w:tabs>
+          <w:tab w:val="num" w:pos="4320"/>
+        </w:tabs>
+        <w:ind w:left="4320" w:hanging="360"/>
+      </w:pPr>
+      <w:rPr>
+        <w:rFonts w:ascii="Wingdings" w:hAnsi="Wingdings" w:hint="default"/>
+        <w:sz w:val="20"/>
+      </w:rPr>
+    </w:lvl>
+    <w:lvl w:ilvl="6" w:tentative="1">
+      <w:start w:val="1"/>
+      <w:numFmt w:val="bullet"/>
+      <w:lvlText w:val=""/>
+      <w:lvlJc w:val="left"/>
+      <w:pPr>
+        <w:tabs>
+          <w:tab w:val="num" w:pos="5040"/>
+        </w:tabs>
+        <w:ind w:left="5040" w:hanging="360"/>
+      </w:pPr>
+      <w:rPr>
+        <w:rFonts w:ascii="Wingdings" w:hAnsi="Wingdings" w:hint="default"/>
+        <w:sz w:val="20"/>
+      </w:rPr>
+    </w:lvl>
+    <w:lvl w:ilvl="7" w:tentative="1">
+      <w:start w:val="1"/>
+      <w:numFmt w:val="bullet"/>
+      <w:lvlText w:val=""/>
+      <w:lvlJc w:val="left"/>
+      <w:pPr>
+        <w:tabs>
+          <w:tab w:val="num" w:pos="5760"/>
+        </w:tabs>
+        <w:ind w:left="5760" w:hanging="360"/>
+      </w:pPr>
+      <w:rPr>
+        <w:rFonts w:ascii="Wingdings" w:hAnsi="Wingdings" w:hint="default"/>
+        <w:sz w:val="20"/>
+      </w:rPr>
+    </w:lvl>
+    <w:lvl w:ilvl="8" w:tentative="1">
+      <w:start w:val="1"/>
+      <w:numFmt w:val="bullet"/>
+      <w:lvlText w:val=""/>
+      <w:lvlJc w:val="left"/>
+      <w:pPr>
+        <w:tabs>
+          <w:tab w:val="num" w:pos="6480"/>
+        </w:tabs>
+        <w:ind w:left="6480" w:hanging="360"/>
+      </w:pPr>
+      <w:rPr>
+        <w:rFonts w:ascii="Wingdings" w:hAnsi="Wingdings" w:hint="default"/>
+        <w:sz w:val="20"/>
+      </w:rPr>
+    </w:lvl>
+  </w:abstractNum>
+  <w:abstractNum w:abstractNumId="4" w15:restartNumberingAfterBreak="0">
+    <w:nsid w:val="75E34EE9"/>
+    <w:multiLevelType w:val="multilevel"/>
+    <w:tmpl w:val="07744CB2"/>
+    <w:lvl w:ilvl="0">
+      <w:start w:val="1"/>
+      <w:numFmt w:val="bullet"/>
+      <w:lvlText w:val=""/>
+      <w:lvlJc w:val="left"/>
+      <w:pPr>
+        <w:tabs>
+          <w:tab w:val="num" w:pos="720"/>
+        </w:tabs>
+        <w:ind w:left="720" w:hanging="360"/>
+      </w:pPr>
+      <w:rPr>
+        <w:rFonts w:ascii="Symbol" w:hAnsi="Symbol" w:hint="default"/>
+        <w:sz w:val="20"/>
+      </w:rPr>
+    </w:lvl>
+    <w:lvl w:ilvl="1">
+      <w:start w:val="1"/>
+      <w:numFmt w:val="bullet"/>
+      <w:lvlText w:val="o"/>
+      <w:lvlJc w:val="left"/>
+      <w:pPr>
+        <w:tabs>
+          <w:tab w:val="num" w:pos="1440"/>
+        </w:tabs>
+        <w:ind w:left="1440" w:hanging="360"/>
+      </w:pPr>
+      <w:rPr>
+        <w:rFonts w:ascii="Courier New" w:hAnsi="Courier New" w:hint="default"/>
+        <w:sz w:val="20"/>
+      </w:rPr>
+    </w:lvl>
+    <w:lvl w:ilvl="2" w:tentative="1">
+      <w:start w:val="1"/>
+      <w:numFmt w:val="bullet"/>
+      <w:lvlText w:val=""/>
+      <w:lvlJc w:val="left"/>
+      <w:pPr>
+        <w:tabs>
+          <w:tab w:val="num" w:pos="2160"/>
+        </w:tabs>
+        <w:ind w:left="2160" w:hanging="360"/>
+      </w:pPr>
+      <w:rPr>
+        <w:rFonts w:ascii="Wingdings" w:hAnsi="Wingdings" w:hint="default"/>
+        <w:sz w:val="20"/>
+      </w:rPr>
+    </w:lvl>
+    <w:lvl w:ilvl="3" w:tentative="1">
+      <w:start w:val="1"/>
+      <w:numFmt w:val="bullet"/>
+      <w:lvlText w:val=""/>
+      <w:lvlJc w:val="left"/>
+      <w:pPr>
+        <w:tabs>
+          <w:tab w:val="num" w:pos="2880"/>
+        </w:tabs>
+        <w:ind w:left="2880" w:hanging="360"/>
+      </w:pPr>
+      <w:rPr>
+        <w:rFonts w:ascii="Wingdings" w:hAnsi="Wingdings" w:hint="default"/>
+        <w:sz w:val="20"/>
+      </w:rPr>
+    </w:lvl>
+    <w:lvl w:ilvl="4" w:tentative="1">
+      <w:start w:val="1"/>
+      <w:numFmt w:val="bullet"/>
+      <w:lvlText w:val=""/>
+      <w:lvlJc w:val="left"/>
+      <w:pPr>
+        <w:tabs>
+          <w:tab w:val="num" w:pos="3600"/>
+        </w:tabs>
+        <w:ind w:left="3600" w:hanging="360"/>
+      </w:pPr>
+      <w:rPr>
+        <w:rFonts w:ascii="Wingdings" w:hAnsi="Wingdings" w:hint="default"/>
+        <w:sz w:val="20"/>
+      </w:rPr>
+    </w:lvl>
+    <w:lvl w:ilvl="5" w:tentative="1">
+      <w:start w:val="1"/>
+      <w:numFmt w:val="bullet"/>
+      <w:lvlText w:val=""/>
+      <w:lvlJc w:val="left"/>
+      <w:pPr>
+        <w:tabs>
+          <w:tab w:val="num" w:pos="4320"/>
+        </w:tabs>
+        <w:ind w:left="4320" w:hanging="360"/>
+      </w:pPr>
+      <w:rPr>
+        <w:rFonts w:ascii="Wingdings" w:hAnsi="Wingdings" w:hint="default"/>
+        <w:sz w:val="20"/>
+      </w:rPr>
+    </w:lvl>
+    <w:lvl w:ilvl="6" w:tentative="1">
+      <w:start w:val="1"/>
+      <w:numFmt w:val="bullet"/>
+      <w:lvlText w:val=""/>
+      <w:lvlJc w:val="left"/>
+      <w:pPr>
+        <w:tabs>
+          <w:tab w:val="num" w:pos="5040"/>
+        </w:tabs>
+        <w:ind w:left="5040" w:hanging="360"/>
+      </w:pPr>
+      <w:rPr>
+        <w:rFonts w:ascii="Wingdings" w:hAnsi="Wingdings" w:hint="default"/>
+        <w:sz w:val="20"/>
+      </w:rPr>
+    </w:lvl>
+    <w:lvl w:ilvl="7" w:tentative="1">
+      <w:start w:val="1"/>
+      <w:numFmt w:val="bullet"/>
+      <w:lvlText w:val=""/>
+      <w:lvlJc w:val="left"/>
+      <w:pPr>
+        <w:tabs>
+          <w:tab w:val="num" w:pos="5760"/>
+        </w:tabs>
+        <w:ind w:left="5760" w:hanging="360"/>
+      </w:pPr>
+      <w:rPr>
+        <w:rFonts w:ascii="Wingdings" w:hAnsi="Wingdings" w:hint="default"/>
+        <w:sz w:val="20"/>
+      </w:rPr>
+    </w:lvl>
+    <w:lvl w:ilvl="8" w:tentative="1">
+      <w:start w:val="1"/>
+      <w:numFmt w:val="bullet"/>
+      <w:lvlText w:val=""/>
+      <w:lvlJc w:val="left"/>
+      <w:pPr>
+        <w:tabs>
+          <w:tab w:val="num" w:pos="6480"/>
+        </w:tabs>
+        <w:ind w:left="6480" w:hanging="360"/>
+      </w:pPr>
+      <w:rPr>
+        <w:rFonts w:ascii="Wingdings" w:hAnsi="Wingdings" w:hint="default"/>
+        <w:sz w:val="20"/>
+      </w:rPr>
+    </w:lvl>
+  </w:abstractNum>
+  <w:num w:numId="1">
+    <w:abstractNumId w:val="3"/>
+  </w:num>
+  <w:num w:numId="2">
+    <w:abstractNumId w:val="0"/>
+  </w:num>
+  <w:num w:numId="3">
+    <w:abstractNumId w:val="1"/>
+  </w:num>
+  <w:num w:numId="4">
+    <w:abstractNumId w:val="2"/>
+  </w:num>
+  <w:num w:numId="5">
+    <w:abstractNumId w:val="4"/>
+  </w:num>
+</w:numbering>
+</file>
+
 <file path=word/styles.xml><?xml version="1.0" encoding="utf-8"?>
-<w:styles xmlns:mc="http://schemas.openxmlformats.org/markup-compatibility/2006" xmlns:r="http://schemas.openxmlformats.org/officeDocument/2006/relationships" xmlns:w="http://schemas.openxmlformats.org/wordprocessingml/2006/main" xmlns:w14="http://schemas.microsoft.com/office/word/2010/wordml" xmlns:w15="http://schemas.microsoft.com/office/word/2012/wordml" xmlns:w16cex="http://schemas.microsoft.com/office/word/2018/wordml/cex" xmlns:w16cid="http://schemas.microsoft.com/office/word/2016/wordml/cid" xmlns:w16="http://schemas.microsoft.com/office/word/2018/wordml" xmlns:w16sdtdh="http://schemas.microsoft.com/office/word/2020/wordml/sdtdatahash" xmlns:w16se="http://schemas.microsoft.com/office/word/2015/wordml/symex" mc:Ignorable="w14 w15 w16se w16cid w16 w16cex w16sdtdh">
+<w:styles xmlns:mc="http://schemas.openxmlformats.org/markup-compatibility/2006" xmlns:r="http://schemas.openxmlformats.org/officeDocument/2006/relationships" xmlns:w="http://schemas.openxmlformats.org/wordprocessingml/2006/main" xmlns:w14="http://schemas.microsoft.com/office/word/2010/wordml" xmlns:w15="http://schemas.microsoft.com/office/word/2012/wordml" mc:Ignorable="w14 w15">
   <w:docDefaults>
     <w:rPrDefault>
       <w:rPr>
@@ -2385,7 +5211,7 @@
     </w:rPrDefault>
     <w:pPrDefault/>
   </w:docDefaults>
-  <w:latentStyles w:defLockedState="0" w:defUIPriority="99" w:defSemiHidden="0" w:defUnhideWhenUsed="0" w:defQFormat="0" w:count="376">
+  <w:latentStyles w:defLockedState="0" w:defUIPriority="99" w:defSemiHidden="0" w:defUnhideWhenUsed="0" w:defQFormat="0" w:count="371">
     <w:lsdException w:name="Normal" w:uiPriority="0" w:qFormat="1"/>
     <w:lsdException w:name="heading 1" w:uiPriority="9" w:qFormat="1"/>
     <w:lsdException w:name="heading 2" w:semiHidden="1" w:uiPriority="9" w:unhideWhenUsed="1" w:qFormat="1"/>
@@ -2540,7 +5366,7 @@
     <w:lsdException w:name="Table Web 2" w:semiHidden="1" w:unhideWhenUsed="1"/>
     <w:lsdException w:name="Table Web 3" w:semiHidden="1" w:unhideWhenUsed="1"/>
     <w:lsdException w:name="Balloon Text" w:semiHidden="1" w:unhideWhenUsed="1"/>
-    <w:lsdException w:name="Table Grid" w:semiHidden="1" w:uiPriority="39" w:unhideWhenUsed="1"/>
+    <w:lsdException w:name="Table Grid" w:uiPriority="39"/>
     <w:lsdException w:name="Table Theme" w:semiHidden="1" w:unhideWhenUsed="1"/>
     <w:lsdException w:name="Placeholder Text" w:semiHidden="1"/>
     <w:lsdException w:name="No Spacing" w:uiPriority="1" w:qFormat="1"/>
@@ -2757,11 +5583,6 @@
     <w:lsdException w:name="List Table 5 Dark Accent 6" w:uiPriority="50"/>
     <w:lsdException w:name="List Table 6 Colorful Accent 6" w:uiPriority="51"/>
     <w:lsdException w:name="List Table 7 Colorful Accent 6" w:uiPriority="52"/>
-    <w:lsdException w:name="Mention" w:semiHidden="1" w:unhideWhenUsed="1"/>
-    <w:lsdException w:name="Smart Hyperlink" w:semiHidden="1" w:unhideWhenUsed="1"/>
-    <w:lsdException w:name="Hashtag" w:semiHidden="1" w:unhideWhenUsed="1"/>
-    <w:lsdException w:name="Unresolved Mention" w:semiHidden="1" w:unhideWhenUsed="1"/>
-    <w:lsdException w:name="Smart Link" w:semiHidden="1" w:unhideWhenUsed="1"/>
   </w:latentStyles>
   <w:style w:type="paragraph" w:default="1" w:styleId="Normale">
     <w:name w:val="Normal"/>
@@ -3407,6 +6228,40 @@
       <w14:ligatures w14:val="none"/>
     </w:rPr>
   </w:style>
+  <w:style w:type="paragraph" w:styleId="NormaleWeb">
+    <w:name w:val="Normal (Web)"/>
+    <w:basedOn w:val="Normale"/>
+    <w:uiPriority w:val="99"/>
+    <w:unhideWhenUsed/>
+    <w:rsid w:val="003F66BA"/>
+    <w:pPr>
+      <w:spacing w:before="100" w:beforeAutospacing="1" w:after="100" w:afterAutospacing="1" w:line="240" w:lineRule="auto"/>
+    </w:pPr>
+    <w:rPr>
+      <w:rFonts w:ascii="Times New Roman" w:eastAsia="Times New Roman" w:hAnsi="Times New Roman" w:cs="Times New Roman"/>
+      <w:sz w:val="24"/>
+      <w:szCs w:val="24"/>
+      <w:lang w:val="it-IT"/>
+    </w:rPr>
+  </w:style>
+  <w:style w:type="character" w:styleId="CodiceHTML">
+    <w:name w:val="HTML Code"/>
+    <w:basedOn w:val="Carpredefinitoparagrafo"/>
+    <w:uiPriority w:val="99"/>
+    <w:semiHidden/>
+    <w:unhideWhenUsed/>
+    <w:rsid w:val="003F66BA"/>
+    <w:rPr>
+      <w:rFonts w:ascii="Courier New" w:eastAsia="Times New Roman" w:hAnsi="Courier New" w:cs="Courier New"/>
+      <w:sz w:val="20"/>
+      <w:szCs w:val="20"/>
+    </w:rPr>
+  </w:style>
+  <w:style w:type="character" w:customStyle="1" w:styleId="math-inline">
+    <w:name w:val="math-inline"/>
+    <w:basedOn w:val="Carpredefinitoparagrafo"/>
+    <w:rsid w:val="003F66BA"/>
+  </w:style>
 </w:styles>
 </file>
 

</xml_diff>